<commit_message>
Cableado LangSmith: ClienteLangChain por defecto, trace en planificar, Tabla 4 con P@1/MRR
</commit_message>
<xml_diff>
--- a/docs/EP1_ISY0101_Informe.docx
+++ b/docs/EP1_ISY0101_Informe.docx
@@ -1,6 +1,6 @@
 
 <file path=word/document.xml><?xml version="1.0" encoding="utf-8"?>
-<w:document xmlns:wpc="http://schemas.microsoft.com/office/word/2010/wordprocessingCanvas" xmlns:mc="http://schemas.openxmlformats.org/markup-compatibility/2006" xmlns:o="urn:schemas-microsoft-com:office:office" xmlns:r="http://schemas.openxmlformats.org/officeDocument/2006/relationships" xmlns:m="http://schemas.openxmlformats.org/officeDocument/2006/math" xmlns:v="urn:schemas-microsoft-com:vml" xmlns:wp14="http://schemas.microsoft.com/office/word/2010/wordprocessingDrawing" xmlns:wp="http://schemas.openxmlformats.org/drawingml/2006/wordprocessingDrawing" xmlns:w10="urn:schemas-microsoft-com:office:word" xmlns:w="http://schemas.openxmlformats.org/wordprocessingml/2006/main" xmlns:w14="http://schemas.microsoft.com/office/word/2010/wordml" xmlns:w15="http://schemas.microsoft.com/office/word/2012/wordml" xmlns:wpg="http://schemas.microsoft.com/office/word/2010/wordprocessingGroup" xmlns:wpi="http://schemas.microsoft.com/office/word/2010/wordprocessingInk" xmlns:wne="http://schemas.microsoft.com/office/word/2006/wordml" xmlns:wps="http://schemas.microsoft.com/office/word/2010/wordprocessingShape" xmlns:cx="http://schemas.microsoft.com/office/drawing/2014/chartex" xmlns:cx1="http://schemas.microsoft.com/office/drawing/2015/9/8/chartex" xmlns:cx2="http://schemas.microsoft.com/office/drawing/2015/10/21/chartex" xmlns:cx3="http://schemas.microsoft.com/office/drawing/2016/5/9/chartex" xmlns:cx4="http://schemas.microsoft.com/office/drawing/2016/5/10/chartex" xmlns:cx5="http://schemas.microsoft.com/office/drawing/2016/5/11/chartex" xmlns:cx6="http://schemas.microsoft.com/office/drawing/2016/5/12/chartex" xmlns:cx7="http://schemas.microsoft.com/office/drawing/2016/5/13/chartex" xmlns:cx8="http://schemas.microsoft.com/office/drawing/2016/5/14/chartex" xmlns:aink="http://schemas.microsoft.com/office/drawing/2016/ink" xmlns:am3d="http://schemas.microsoft.com/office/drawing/2017/model3d" xmlns:w16cex="http://schemas.microsoft.com/office/word/2018/wordml/cex" xmlns:w16cid="http://schemas.microsoft.com/office/word/2016/wordml/cid" xmlns:w16="http://schemas.microsoft.com/office/word/2018/wordml" xmlns:w16sdtdh="http://schemas.microsoft.com/office/word/2020/wordml/sdtdatahash" xmlns:w16se="http://schemas.microsoft.com/office/word/2015/wordml/symex" mc:Ignorable="w14 w15 wp14">
+<w:document xmlns:wpc="http://schemas.microsoft.com/office/word/2010/wordprocessingCanvas" xmlns:mc="http://schemas.openxmlformats.org/markup-compatibility/2006" xmlns:o="urn:schemas-microsoft-com:office:office" xmlns:r="http://schemas.openxmlformats.org/officeDocument/2006/relationships" xmlns:m="http://schemas.openxmlformats.org/officeDocument/2006/math" xmlns:v="urn:schemas-microsoft-com:vml" xmlns:wp14="http://schemas.microsoft.com/office/word/2010/wordprocessingDrawing" xmlns:wp="http://schemas.openxmlformats.org/drawingml/2006/wordprocessingDrawing" xmlns:w10="urn:schemas-microsoft-com:office:word" xmlns:w="http://schemas.openxmlformats.org/wordprocessingml/2006/main" xmlns:w14="http://schemas.microsoft.com/office/word/2010/wordml" xmlns:w15="http://schemas.microsoft.com/office/word/2012/wordml" xmlns:w16se="http://schemas.microsoft.com/office/word/2015/wordml/symex" xmlns:w16cid="http://schemas.microsoft.com/office/word/2016/wordml/cid" xmlns:w16="http://schemas.microsoft.com/office/word/2018/wordml" xmlns:w16cex="http://schemas.microsoft.com/office/word/2018/wordml/cex" xmlns:w16sdtdh="http://schemas.microsoft.com/office/word/2020/wordml/sdtdatahash" xmlns:wne="http://schemas.microsoft.com/office/word/2006/wordml" xmlns:wpg="http://schemas.microsoft.com/office/word/2010/wordprocessingGroup" xmlns:wps="http://schemas.microsoft.com/office/word/2010/wordprocessingShape" mc:Ignorable="w14 w15 w16se w16cid w16 w16cex w16sdtdh wp14">
   <w:body>
     <w:p>
       <w:pPr>
@@ -8,11 +8,10 @@
       </w:pPr>
       <w:r>
         <w:rPr>
-          <w:rFonts w:ascii="Times New Roman" w:cs="Times New Roman" w:eastAsia="Times New Roman" w:hAnsi="Times New Roman"/>
-          <w:sz w:val="22"/>
-          <w:szCs w:val="22"/>
-        </w:rPr>
-        <w:t xml:space="preserve"/>
+          <w:rFonts w:ascii="Times New Roman" w:hAnsi="Times New Roman" w:eastAsia="Times New Roman" w:cs="Times New Roman"/>
+          <w:sz w:val="22"/>
+          <w:szCs w:val="22"/>
+        </w:rPr>
       </w:r>
     </w:p>
     <w:p>
@@ -22,13 +21,13 @@
       </w:pPr>
       <w:r>
         <w:rPr>
-          <w:rFonts w:ascii="Times New Roman" w:cs="Times New Roman" w:eastAsia="Times New Roman" w:hAnsi="Times New Roman"/>
+          <w:rFonts w:ascii="Times New Roman" w:hAnsi="Times New Roman" w:eastAsia="Times New Roman" w:cs="Times New Roman"/>
           <w:b/>
           <w:bCs/>
           <w:sz w:val="32"/>
           <w:szCs w:val="32"/>
         </w:rPr>
-        <w:t xml:space="preserve">DiseÃ±o de una SoluciÃ³n con Agente LLM y RAG para la ReplanificaciÃ³n AutomÃ¡tica de Itinerarios de Ecoturismo</w:t>
+        <w:t>Diseño de una Solución con Agente LLM y RAG para la Replanificación Automática de Itinerarios de Ecoturismo</w:t>
       </w:r>
     </w:p>
     <w:p>
@@ -38,11 +37,11 @@
       </w:pPr>
       <w:r>
         <w:rPr>
-          <w:rFonts w:ascii="Times New Roman" w:cs="Times New Roman" w:eastAsia="Times New Roman" w:hAnsi="Times New Roman"/>
+          <w:rFonts w:ascii="Times New Roman" w:hAnsi="Times New Roman" w:eastAsia="Times New Roman" w:cs="Times New Roman"/>
           <w:sz w:val="24"/>
           <w:szCs w:val="24"/>
         </w:rPr>
-        <w:t xml:space="preserve">Informe TÃ©cnico â€” EvaluaciÃ³n Parcial NÂ°1 (30%)</w:t>
+        <w:t>Informe Técnico — Evaluación Parcial N°1 (30%)</w:t>
       </w:r>
     </w:p>
     <w:p>
@@ -52,11 +51,11 @@
       </w:pPr>
       <w:r>
         <w:rPr>
-          <w:rFonts w:ascii="Times New Roman" w:cs="Times New Roman" w:eastAsia="Times New Roman" w:hAnsi="Times New Roman"/>
+          <w:rFonts w:ascii="Times New Roman" w:hAnsi="Times New Roman" w:eastAsia="Times New Roman" w:cs="Times New Roman"/>
           <w:sz w:val="24"/>
           <w:szCs w:val="24"/>
         </w:rPr>
-        <w:t xml:space="preserve">ISY0101 â€” IngenierÃ­a de Soluciones con IA</w:t>
+        <w:t>ISY0101 — Ingeniería de Soluciones con IA</w:t>
       </w:r>
     </w:p>
     <w:p>
@@ -66,11 +65,39 @@
       </w:pPr>
       <w:r>
         <w:rPr>
-          <w:rFonts w:ascii="Times New Roman" w:cs="Times New Roman" w:eastAsia="Times New Roman" w:hAnsi="Times New Roman"/>
+          <w:rFonts w:ascii="Times New Roman" w:hAnsi="Times New Roman" w:eastAsia="Times New Roman" w:cs="Times New Roman"/>
+          <w:sz w:val="22"/>
+          <w:szCs w:val="22"/>
+        </w:rPr>
+        <w:t>Benjamín Ibáñez</w:t>
+      </w:r>
+    </w:p>
+    <w:p>
+      <w:pPr>
+        <w:spacing w:after="80" w:line="264"/>
+        <w:jc w:val="center"/>
+      </w:pPr>
+      <w:r>
+        <w:rPr>
+          <w:rFonts w:ascii="Times New Roman" w:hAnsi="Times New Roman" w:eastAsia="Times New Roman" w:cs="Times New Roman"/>
+          <w:sz w:val="22"/>
+          <w:szCs w:val="22"/>
+        </w:rPr>
+        <w:t>Docente: Giocrisrai Godoy · Sección 001D</w:t>
+      </w:r>
+    </w:p>
+    <w:p>
+      <w:pPr>
+        <w:spacing w:after="80" w:line="264"/>
+        <w:jc w:val="center"/>
+      </w:pPr>
+      <w:r>
+        <w:rPr>
+          <w:rFonts w:ascii="Times New Roman" w:hAnsi="Times New Roman" w:eastAsia="Times New Roman" w:cs="Times New Roman"/>
           <w:sz w:val="24"/>
           <w:szCs w:val="24"/>
         </w:rPr>
-        <w:t xml:space="preserve">[Integrante 1], [Integrante 2]</w:t>
+        <w:t>DUOC UC</w:t>
       </w:r>
     </w:p>
     <w:p>
@@ -80,60 +107,36 @@
       </w:pPr>
       <w:r>
         <w:rPr>
-          <w:rFonts w:ascii="Times New Roman" w:cs="Times New Roman" w:eastAsia="Times New Roman" w:hAnsi="Times New Roman"/>
+          <w:rFonts w:ascii="Times New Roman" w:hAnsi="Times New Roman" w:eastAsia="Times New Roman" w:cs="Times New Roman"/>
           <w:sz w:val="24"/>
           <w:szCs w:val="24"/>
         </w:rPr>
-        <w:t xml:space="preserve">Docente: [Nombre del docente]</w:t>
-      </w:r>
-    </w:p>
-    <w:p>
-      <w:pPr>
-        <w:spacing w:after="80" w:line="264"/>
-        <w:jc w:val="center"/>
-      </w:pPr>
-      <w:r>
-        <w:rPr>
-          <w:rFonts w:ascii="Times New Roman" w:cs="Times New Roman" w:eastAsia="Times New Roman" w:hAnsi="Times New Roman"/>
-          <w:sz w:val="24"/>
-          <w:szCs w:val="24"/>
-        </w:rPr>
-        <w:t xml:space="preserve">DUOC UC</w:t>
-      </w:r>
-    </w:p>
-    <w:p>
-      <w:pPr>
-        <w:spacing w:after="80" w:line="264"/>
-        <w:jc w:val="center"/>
-      </w:pPr>
-      <w:r>
-        <w:rPr>
-          <w:rFonts w:ascii="Times New Roman" w:cs="Times New Roman" w:eastAsia="Times New Roman" w:hAnsi="Times New Roman"/>
-          <w:sz w:val="24"/>
-          <w:szCs w:val="24"/>
-        </w:rPr>
-        <w:t xml:space="preserve">Septiembre de 2026</w:t>
-      </w:r>
-    </w:p>
-    <w:p>
-      <w:r>
-        <w:br w:type="page"/>
+        <w:t>Septiembre de 2026</w:t>
+      </w:r>
+    </w:p>
+    <w:p>
+      <w:pPr>
+        <w:pageBreakBefore/>
+      </w:pPr>
+      <w:r>
+        <w:lastRenderedPageBreak/>
       </w:r>
     </w:p>
     <w:p>
       <w:pPr>
         <w:pStyle w:val="Heading1"/>
-        <w:spacing w:after="60" w:before="120"/>
-      </w:pPr>
-      <w:r>
-        <w:rPr>
-          <w:rFonts w:ascii="Times New Roman" w:cs="Times New Roman" w:eastAsia="Times New Roman" w:hAnsi="Times New Roman"/>
+        <w:spacing w:before="120" w:after="60"/>
+      </w:pPr>
+      <w:r>
+        <w:rPr>
+          <w:rFonts w:ascii="Times New Roman" w:hAnsi="Times New Roman" w:eastAsia="Times New Roman" w:cs="Times New Roman"/>
           <w:b/>
           <w:bCs/>
+          <w:color w:val="2E74B5"/>
           <w:sz w:val="26"/>
           <w:szCs w:val="26"/>
         </w:rPr>
-        <w:t xml:space="preserve">AnÃ¡lisis del Caso Organizacional</w:t>
+        <w:t>Análisis del Caso Organizacional</w:t>
       </w:r>
     </w:p>
     <w:p>
@@ -142,11 +145,11 @@
       </w:pPr>
       <w:r>
         <w:rPr>
-          <w:rFonts w:ascii="Times New Roman" w:cs="Times New Roman" w:eastAsia="Times New Roman" w:hAnsi="Times New Roman"/>
-          <w:sz w:val="22"/>
-          <w:szCs w:val="22"/>
-        </w:rPr>
-        <w:t xml:space="preserve">La organizaciÃ³n del caso es una agencia boutique de ecoturismo del sur de Chile que arma itinerarios personalizados (kayak, trekking, ciclismo, observaciÃ³n de fauna) en Los Lagos, AraucanÃ­a y Magallanes. Su operaciÃ³n depende de condiciones variables: senderos que CONAF cierra por mantenimiento o clima, frentes de lluvia y viento en la Patagonia, y guÃ­as con agenda acotada. Hoy el armado es manual: un operador revisa planillas de paquetes, consulta el clima y llama a los guÃ­as, y cuando algo falla replanifica a mano, con demoras y riesgo de ofrecer itinerarios inviables.</w:t>
+          <w:rFonts w:ascii="Times New Roman" w:hAnsi="Times New Roman" w:eastAsia="Times New Roman" w:cs="Times New Roman"/>
+          <w:sz w:val="22"/>
+          <w:szCs w:val="22"/>
+        </w:rPr>
+        <w:t>La organización del caso es una agencia boutique de ecoturismo del sur de Chile que arma itinerarios personalizados (kayak, trekking, ciclismo, observación de fauna) en Los Lagos, Araucanía y Magallanes. Su operación depende de condiciones variables: senderos que CONAF cierra por mantenimiento o clima, frentes de lluvia y viento en la Patagonia, y guías con agenda acotada. Hoy el armado es manual: un operador revisa planillas de paquetes, consulta el clima y llama a los guías, y cuando algo falla replanifica a mano, con demoras y riesgo de ofrecer itinerarios inviables.</w:t>
       </w:r>
     </w:p>
     <w:p>
@@ -155,11 +158,11 @@
       </w:pPr>
       <w:r>
         <w:rPr>
-          <w:rFonts w:ascii="Times New Roman" w:cs="Times New Roman" w:eastAsia="Times New Roman" w:hAnsi="Times New Roman"/>
-          <w:sz w:val="22"/>
-          <w:szCs w:val="22"/>
-        </w:rPr>
-        <w:t xml:space="preserve">Los requerimientos especÃ­ficos que la soluciÃ³n debe cubrir son: (1) recuperar internamente los paquetes que calzan con el perfil del cliente; (2) verificar fuentes externas antes de proponer (clima real y estado de senderos); (3) ante un conflicto, replanificar eligiendo una alternativa viable, no solo informar el problema; (4) citar la fuente que respalda cada decisiÃ³n del itinerario; y (5) registrar trazabilidad de cada paso. El objetivo medible fijado fue un agente que resuelva estos cinco puntos con una tasa de acierto igual o superior a 85% en un conjunto de evaluaciÃ³n con casos de conflicto y sin conflicto.</w:t>
+          <w:rFonts w:ascii="Times New Roman" w:hAnsi="Times New Roman" w:eastAsia="Times New Roman" w:cs="Times New Roman"/>
+          <w:sz w:val="22"/>
+          <w:szCs w:val="22"/>
+        </w:rPr>
+        <w:t>Los requerimientos específicos que la solución debe cubrir son: (1) recuperar internamente los paquetes que calzan con el perfil del cliente; (2) verificar fuentes externas antes de proponer (clima real y estado de senderos); (3) ante un conflicto, replanificar eligiendo una alternativa viable, no solo informar el problema; (4) citar la fuente que respalda cada decisión del itinerario; y (5) registrar trazabilidad de cada paso. El objetivo medible fijado fue un agente que resuelva estos cinco puntos con una tasa de acierto igual o superior a 85% en un conjunto de evaluación con casos de conflicto y sin conflicto.</w:t>
       </w:r>
     </w:p>
     <w:p>
@@ -168,27 +171,28 @@
       </w:pPr>
       <w:r>
         <w:rPr>
-          <w:rFonts w:ascii="Times New Roman" w:cs="Times New Roman" w:eastAsia="Times New Roman" w:hAnsi="Times New Roman"/>
-          <w:sz w:val="22"/>
-          <w:szCs w:val="22"/>
-        </w:rPr>
-        <w:t xml:space="preserve">La motivaciÃ³n para usar agentes con LLM y RAG es que el problema es conversacional y multipaso: entender un pedido en lenguaje natural, decidir quÃ© verificar, usar herramientas y replanificar. Un LLM solo no basta (inventa disponibilidad y clima); el RAG acota al contexto verificado y las herramientas dan datos externos reales, con el loop de razonamiento-acciÃ³n como controlador explÃ­cito.</w:t>
+          <w:rFonts w:ascii="Times New Roman" w:hAnsi="Times New Roman" w:eastAsia="Times New Roman" w:cs="Times New Roman"/>
+          <w:sz w:val="22"/>
+          <w:szCs w:val="22"/>
+        </w:rPr>
+        <w:t>La motivación para usar agentes con LLM y RAG (Lewis et al., 2020) es que el problema es conversacional y multipaso: entender un pedido en lenguaje natural, decidir qué verificar, usar herramientas y replanificar. Un LLM solo no basta (inventa disponibilidad y clima); el RAG acota al contexto verificado y las herramientas dan datos externos reales, con el loop de razonamiento-acción como controlador explícito.</w:t>
       </w:r>
     </w:p>
     <w:p>
       <w:pPr>
         <w:pStyle w:val="Heading1"/>
-        <w:spacing w:after="60" w:before="120"/>
-      </w:pPr>
-      <w:r>
-        <w:rPr>
-          <w:rFonts w:ascii="Times New Roman" w:cs="Times New Roman" w:eastAsia="Times New Roman" w:hAnsi="Times New Roman"/>
+        <w:spacing w:before="120" w:after="60"/>
+      </w:pPr>
+      <w:r>
+        <w:rPr>
+          <w:rFonts w:ascii="Times New Roman" w:hAnsi="Times New Roman" w:eastAsia="Times New Roman" w:cs="Times New Roman"/>
           <w:b/>
           <w:bCs/>
+          <w:color w:val="2E74B5"/>
           <w:sz w:val="26"/>
           <w:szCs w:val="26"/>
         </w:rPr>
-        <w:t xml:space="preserve">FormulaciÃ³n de Prompts</w:t>
+        <w:t>Formulación de Prompts</w:t>
       </w:r>
     </w:p>
     <w:p>
@@ -197,45 +201,501 @@
       </w:pPr>
       <w:r>
         <w:rPr>
-          <w:rFonts w:ascii="Times New Roman" w:cs="Times New Roman" w:eastAsia="Times New Roman" w:hAnsi="Times New Roman"/>
-          <w:sz w:val="22"/>
-          <w:szCs w:val="22"/>
-        </w:rPr>
-        <w:t xml:space="preserve">Los prompts viven en agent/prompts.py y se componen de dos partes. El prompt de sistema (SISTEMA_BASE) fija el rol â€”asesor de una agencia boutiqueâ€” y reglas duras: responder solo con el contexto recuperado, citar cada afirmaciÃ³n con [F#] para fragmentos recuperados y [T#] para resultados de herramientas, y si el contexto no alcanza, decirlo en vez de inventar. El prompt de usuario se arma por plantilla (PLANTILLA_USUARIO/funciÃ³n armar_usuario) con el pedido del cliente, los fragmentos numerados y los resultados de herramientas, de modo que cada cita apunte a un bloque identificable.</w:t>
-      </w:r>
-    </w:p>
-    <w:p>
-      <w:pPr>
-        <w:spacing w:after="80" w:line="264"/>
-      </w:pPr>
-      <w:r>
-        <w:rPr>
-          <w:rFonts w:ascii="Times New Roman" w:cs="Times New Roman" w:eastAsia="Times New Roman" w:hAnsi="Times New Roman"/>
-          <w:sz w:val="22"/>
-          <w:szCs w:val="22"/>
-        </w:rPr>
-        <w:t xml:space="preserve">Para la replanificaciÃ³n se sumÃ³ un segundo prompt de sistema (SISTEMA_REPLAN) que solo se activa cuando hubo conflicto: obliga a explicar por quÃ© se descartÃ³ el plan original y a citar las fuentes de la alternativa. Se eligieron temperaturas bajas (0.2) y lÃ­mite de salida (1.024 tokens) para respuestas deterministas y breves. La justificaciÃ³n de esta redacciÃ³n es directa sobre los requerimientos: sin citas obligatorias el encargo de trazabilidad no se cumple, y sin la regla de negaciÃ³n honesta el modelo tiende a fabricar disponibilidad de guÃ­as.</w:t>
-      </w:r>
-    </w:p>
-    <w:p>
-      <w:r>
-        <w:br w:type="page"/>
-      </w:r>
-    </w:p>
-    <w:p>
-      <w:pPr>
-        <w:pStyle w:val="Heading1"/>
-        <w:spacing w:after="60" w:before="120"/>
-      </w:pPr>
-      <w:r>
-        <w:rPr>
-          <w:rFonts w:ascii="Times New Roman" w:cs="Times New Roman" w:eastAsia="Times New Roman" w:hAnsi="Times New Roman"/>
+          <w:rFonts w:ascii="Times New Roman" w:hAnsi="Times New Roman" w:eastAsia="Times New Roman" w:cs="Times New Roman"/>
+          <w:sz w:val="22"/>
+          <w:szCs w:val="22"/>
+        </w:rPr>
+        <w:t>Los prompts viven en agent/prompts.py y se componen de dos partes. El prompt de sistema (SISTEMA_BASE) fija el rol —asesor de una agencia boutique— y reglas duras: responder solo con el contexto recuperado, citar cada afirmación con [F#] para fragmentos recuperados y [T#] para resultados de herramientas, y si el contexto no alcanza, decirlo en vez de inventar. El prompt de usuario se arma por plantilla (PLANTILLA_USUARIO/función armar_usuario) con el pedido del cliente, los fragmentos numerados y los resultados de herramientas, de modo que cada cita apunte a un bloque identificable.</w:t>
+      </w:r>
+    </w:p>
+    <w:p>
+      <w:pPr>
+        <w:spacing w:before="0" w:after="160"/>
+      </w:pPr>
+      <w:r>
+        <w:rPr>
+          <w:rFonts w:ascii="Times New Roman" w:hAnsi="Times New Roman" w:eastAsia="Times New Roman" w:cs="Times New Roman"/>
+          <w:i/>
+          <w:iCs/>
+          <w:sz w:val="22"/>
+          <w:szCs w:val="22"/>
+        </w:rPr>
+        <w:t>Recuadro B1 — Prompt de sistema y plantilla (extracto literal de agent/prompts.py).</w:t>
+      </w:r>
+    </w:p>
+    <w:p>
+      <w:pPr>
+        <w:spacing w:before="0" w:after="0"/>
+      </w:pPr>
+      <w:r>
+        <w:rPr>
+          <w:rFonts w:ascii="Times New Roman" w:hAnsi="Times New Roman" w:eastAsia="Times New Roman" w:cs="Times New Roman"/>
           <w:b/>
           <w:bCs/>
+          <w:sz w:val="22"/>
+          <w:szCs w:val="22"/>
+        </w:rPr>
+        <w:t>SISTEMA_BASE (reglas 1-3 y 6):</w:t>
+      </w:r>
+    </w:p>
+    <w:p>
+      <w:pPr>
+        <w:spacing w:before="0" w:after="0"/>
+      </w:pPr>
+      <w:r>
+        <w:rPr>
+          <w:rFonts w:ascii="Consolas" w:hAnsi="Consolas" w:eastAsia="Times New Roman" w:cs="Times New Roman"/>
+          <w:sz w:val="17"/>
+          <w:szCs w:val="22"/>
+        </w:rPr>
+        <w:t>1. Responde SOLO con informacion del CONTEXTO RECUPERADO. [...]</w:t>
+      </w:r>
+    </w:p>
+    <w:p>
+      <w:pPr>
+        <w:spacing w:before="0" w:after="0"/>
+      </w:pPr>
+      <w:r>
+        <w:rPr>
+          <w:rFonts w:ascii="Consolas" w:hAnsi="Consolas" w:eastAsia="Times New Roman" w:cs="Times New Roman"/>
+          <w:sz w:val="17"/>
+          <w:szCs w:val="22"/>
+        </w:rPr>
+        <w:t>2. Cita cada afirmacion factual con [F1], [F2], etc. Sin cita = sin afirmacion.</w:t>
+      </w:r>
+    </w:p>
+    <w:p>
+      <w:pPr>
+        <w:spacing w:before="0" w:after="0"/>
+      </w:pPr>
+      <w:r>
+        <w:rPr>
+          <w:rFonts w:ascii="Consolas" w:hAnsi="Consolas" w:eastAsia="Times New Roman" w:cs="Times New Roman"/>
+          <w:sz w:val="17"/>
+          <w:szCs w:val="22"/>
+        </w:rPr>
+        <w:t>3. Si el contexto no basta: "No tengo informacion suficiente [...]".</w:t>
+      </w:r>
+    </w:p>
+    <w:p>
+      <w:pPr>
+        <w:spacing w:before="0" w:after="0"/>
+      </w:pPr>
+      <w:r>
+        <w:rPr>
+          <w:rFonts w:ascii="Consolas" w:hAnsi="Consolas" w:eastAsia="Times New Roman" w:cs="Times New Roman"/>
+          <w:sz w:val="17"/>
+          <w:szCs w:val="22"/>
+        </w:rPr>
+        <w:t>6. Si hay RESULTADOS DE HERRAMIENTAS EXTERNAS ([T1]...), usalos para validar [...]</w:t>
+      </w:r>
+    </w:p>
+    <w:p>
+      <w:pPr>
+        <w:spacing w:before="0" w:after="0"/>
+      </w:pPr>
+      <w:r>
+        <w:rPr>
+          <w:rFonts w:ascii="Times New Roman" w:hAnsi="Times New Roman" w:eastAsia="Times New Roman" w:cs="Times New Roman"/>
+          <w:b/>
+          <w:bCs/>
+          <w:sz w:val="22"/>
+          <w:szCs w:val="22"/>
+        </w:rPr>
+        <w:t>PLANTILLA_USUARIO (función armar_usuario):</w:t>
+      </w:r>
+    </w:p>
+    <w:p>
+      <w:pPr>
+        <w:spacing w:before="0" w:after="0"/>
+      </w:pPr>
+      <w:r>
+        <w:rPr>
+          <w:rFonts w:ascii="Consolas" w:hAnsi="Consolas" w:eastAsia="Times New Roman" w:cs="Times New Roman"/>
+          <w:sz w:val="17"/>
+          <w:szCs w:val="22"/>
+        </w:rPr>
+        <w:t xml:space="preserve">CONTEXTO RECUPERADO: {bloque_contexto}   # [F#] (fuente, tipo) + texto</w:t>
+      </w:r>
+    </w:p>
+    <w:p>
+      <w:pPr>
+        <w:spacing w:before="0" w:after="0"/>
+      </w:pPr>
+      <w:r>
+        <w:rPr>
+          <w:rFonts w:ascii="Consolas" w:hAnsi="Consolas" w:eastAsia="Times New Roman" w:cs="Times New Roman"/>
+          <w:sz w:val="17"/>
+          <w:szCs w:val="22"/>
+        </w:rPr>
+        <w:t xml:space="preserve">{bloque_herramientas}                    # [T#] (fuente) + texto</w:t>
+      </w:r>
+    </w:p>
+    <w:p>
+      <w:pPr>
+        <w:spacing w:before="0" w:after="0"/>
+      </w:pPr>
+      <w:r>
+        <w:rPr>
+          <w:rFonts w:ascii="Consolas" w:hAnsi="Consolas" w:eastAsia="Times New Roman" w:cs="Times New Roman"/>
+          <w:sz w:val="17"/>
+          <w:szCs w:val="22"/>
+        </w:rPr>
+        <w:t>PEDIDO DEL CLIENTE: {consulta}</w:t>
+      </w:r>
+    </w:p>
+    <w:p>
+      <w:pPr>
+        <w:spacing w:before="0" w:after="160"/>
+      </w:pPr>
+      <w:r>
+        <w:rPr>
+          <w:rFonts w:ascii="Times New Roman" w:hAnsi="Times New Roman" w:eastAsia="Times New Roman" w:cs="Times New Roman"/>
+          <w:i/>
+          <w:iCs/>
+          <w:sz w:val="22"/>
+          <w:szCs w:val="22"/>
+        </w:rPr>
+        <w:t>(Extracto; fuente completa: agent/prompts.py, 45 líneas.)</w:t>
+      </w:r>
+    </w:p>
+    <w:p>
+      <w:pPr>
+        <w:spacing w:before="0" w:after="160"/>
+      </w:pPr>
+      <w:r>
+        <w:rPr>
+          <w:rFonts w:ascii="Times New Roman" w:hAnsi="Times New Roman" w:eastAsia="Times New Roman" w:cs="Times New Roman"/>
+          <w:b/>
+          <w:bCs/>
+          <w:sz w:val="22"/>
+          <w:szCs w:val="22"/>
+        </w:rPr>
+        <w:t>Ejemplo E01 — kayak suave para principiantes en Chiloé, 2026-12-08 (salida real, ClienteFalso determinista).</w:t>
+      </w:r>
+    </w:p>
+    <w:p>
+      <w:pPr>
+        <w:spacing w:before="0" w:after="160"/>
+      </w:pPr>
+      <w:r>
+        <w:rPr>
+          <w:rFonts w:ascii="Times New Roman" w:hAnsi="Times New Roman" w:eastAsia="Times New Roman" w:cs="Times New Roman"/>
+          <w:sz w:val="22"/>
+          <w:szCs w:val="22"/>
+        </w:rPr>
+        <w:t>Respuesta: "(respuesta simulada) Itinerario propuesto [...] recomiendo la alternativa descrita en [F1]. [F1] [F2] [F3] [F4] [F5] [T1] [T2] [T3]".</w:t>
+      </w:r>
+    </w:p>
+    <w:p>
+      <w:pPr>
+        <w:spacing w:before="0" w:after="160"/>
+      </w:pPr>
+      <w:r>
+        <w:rPr>
+          <w:rFonts w:ascii="Times New Roman" w:hAnsi="Times New Roman" w:eastAsia="Times New Roman" w:cs="Times New Roman"/>
+          <w:sz w:val="22"/>
+          <w:szCs w:val="22"/>
+        </w:rPr>
+        <w:t>Paquete final: PAQ-001 · Conflictos: sin conflictos · Fuentes citadas: PAQ-001, PAQ-007, PAQ-005, PAQ-003, trail_status.json (simulada), open-meteo.com, guias_roster.json (interno).</w:t>
+      </w:r>
+    </w:p>
+    <w:p>
+      <w:pPr>
+        <w:spacing w:after="80" w:line="264"/>
+      </w:pPr>
+      <w:r>
+        <w:rPr>
+          <w:rFonts w:ascii="Times New Roman" w:hAnsi="Times New Roman" w:eastAsia="Times New Roman" w:cs="Times New Roman"/>
+          <w:sz w:val="22"/>
+          <w:szCs w:val="22"/>
+        </w:rPr>
+        <w:t>Para la replanificación se sumó un segundo prompt de sistema (SISTEMA_REPLAN) que solo se activa cuando hubo conflicto: obliga a explicar por qué se descartó el plan original y a citar las fuentes de la alternativa. Se eligieron temperaturas bajas (0.2) y límite de salida (1.024 tokens) para respuestas deterministas y breves. La justificación de esta redacción es directa sobre los requerimientos: sin citas obligatorias el encargo de trazabilidad no se cumple, y sin la regla de negación honesta el modelo tiende a fabricar disponibilidad de guías.</w:t>
+      </w:r>
+    </w:p>
+    <w:p>
+      <w:pPr>
+        <w:spacing w:before="0" w:after="0"/>
+      </w:pPr>
+      <w:r>
+        <w:rPr>
+          <w:rFonts w:ascii="Times New Roman" w:hAnsi="Times New Roman" w:eastAsia="Times New Roman" w:cs="Times New Roman"/>
+          <w:b/>
+          <w:bCs/>
+          <w:sz w:val="22"/>
+          <w:szCs w:val="22"/>
+        </w:rPr>
+        <w:t>Tabla 3</w:t>
+      </w:r>
+    </w:p>
+    <w:p>
+      <w:pPr>
+        <w:spacing w:before="0" w:after="160"/>
+      </w:pPr>
+      <w:r>
+        <w:rPr>
+          <w:rFonts w:ascii="Times New Roman" w:hAnsi="Times New Roman" w:eastAsia="Times New Roman" w:cs="Times New Roman"/>
+          <w:i/>
+          <w:iCs/>
+          <w:sz w:val="22"/>
+          <w:szCs w:val="22"/>
+        </w:rPr>
+        <w:t>Comparación de prompts: activación, reglas y justificación</w:t>
+      </w:r>
+    </w:p>
+    <w:tbl>
+      <w:tblPr>
+        <w:tblW w:w="0" w:type="auto"/>
+        <w:tblLook w:firstRow="1" w:firstColumn="1" w:noVBand="1"/>
+      </w:tblPr>
+      <w:tblGrid>
+        <w:gridCol w:w="3009"/>
+        <w:gridCol w:w="3009"/>
+        <w:gridCol w:w="3009"/>
+      </w:tblGrid>
+      <w:tr>
+        <w:tc>
+          <w:tcPr>
+            <w:tcW w:w="3009" w:type="dxa"/>
+          </w:tcPr>
+          <w:p>
+            <w:r/>
+            <w:r>
+              <w:rPr>
+                <w:rFonts w:ascii="Times New Roman" w:hAnsi="Times New Roman" w:eastAsia="Times New Roman" w:cs="Times New Roman"/>
+                <w:b/>
+                <w:bCs/>
+                <w:sz w:val="22"/>
+                <w:szCs w:val="22"/>
+              </w:rPr>
+              <w:t>Prompt</w:t>
+            </w:r>
+          </w:p>
+        </w:tc>
+        <w:tc>
+          <w:tcPr>
+            <w:tcW w:w="3009" w:type="dxa"/>
+          </w:tcPr>
+          <w:p>
+            <w:r/>
+            <w:r>
+              <w:rPr>
+                <w:rFonts w:ascii="Times New Roman" w:hAnsi="Times New Roman" w:eastAsia="Times New Roman" w:cs="Times New Roman"/>
+                <w:b/>
+                <w:bCs/>
+                <w:sz w:val="22"/>
+                <w:szCs w:val="22"/>
+              </w:rPr>
+              <w:t>Cuándo se activa</w:t>
+            </w:r>
+          </w:p>
+        </w:tc>
+        <w:tc>
+          <w:tcPr>
+            <w:tcW w:w="3009" w:type="dxa"/>
+          </w:tcPr>
+          <w:p>
+            <w:r/>
+            <w:r>
+              <w:rPr>
+                <w:rFonts w:ascii="Times New Roman" w:hAnsi="Times New Roman" w:eastAsia="Times New Roman" w:cs="Times New Roman"/>
+                <w:b/>
+                <w:bCs/>
+                <w:sz w:val="22"/>
+                <w:szCs w:val="22"/>
+              </w:rPr>
+              <w:t>Reglas clave y justificación</w:t>
+            </w:r>
+          </w:p>
+        </w:tc>
+      </w:tr>
+      <w:tr>
+        <w:tc>
+          <w:tcPr>
+            <w:tcW w:w="3009" w:type="dxa"/>
+          </w:tcPr>
+          <w:p>
+            <w:r/>
+            <w:r>
+              <w:rPr>
+                <w:rFonts w:ascii="Times New Roman" w:hAnsi="Times New Roman" w:eastAsia="Times New Roman" w:cs="Times New Roman"/>
+                <w:sz w:val="22"/>
+                <w:szCs w:val="22"/>
+              </w:rPr>
+              <w:t>SISTEMA_BASE</w:t>
+            </w:r>
+          </w:p>
+        </w:tc>
+        <w:tc>
+          <w:tcPr>
+            <w:tcW w:w="3009" w:type="dxa"/>
+          </w:tcPr>
+          <w:p>
+            <w:r/>
+            <w:r>
+              <w:rPr>
+                <w:rFonts w:ascii="Times New Roman" w:hAnsi="Times New Roman" w:eastAsia="Times New Roman" w:cs="Times New Roman"/>
+                <w:sz w:val="22"/>
+                <w:szCs w:val="22"/>
+              </w:rPr>
+              <w:t>Toda consulta</w:t>
+            </w:r>
+          </w:p>
+        </w:tc>
+        <w:tc>
+          <w:tcPr>
+            <w:tcW w:w="3009" w:type="dxa"/>
+          </w:tcPr>
+          <w:p>
+            <w:r/>
+            <w:r>
+              <w:rPr>
+                <w:rFonts w:ascii="Times New Roman" w:hAnsi="Times New Roman" w:eastAsia="Times New Roman" w:cs="Times New Roman"/>
+                <w:sz w:val="22"/>
+                <w:szCs w:val="22"/>
+              </w:rPr>
+              <w:t>Reglas 1-6: solo contexto, citas [F#]/[T#], negativa honesta; temp 0,2 y 1024 tokens → respuestas cortas y trazables.</w:t>
+            </w:r>
+          </w:p>
+        </w:tc>
+      </w:tr>
+      <w:tr>
+        <w:tc>
+          <w:tcPr>
+            <w:tcW w:w="3009" w:type="dxa"/>
+          </w:tcPr>
+          <w:p>
+            <w:r/>
+            <w:r>
+              <w:rPr>
+                <w:rFonts w:ascii="Times New Roman" w:hAnsi="Times New Roman" w:eastAsia="Times New Roman" w:cs="Times New Roman"/>
+                <w:sz w:val="22"/>
+                <w:szCs w:val="22"/>
+              </w:rPr>
+              <w:t>SISTEMA_REPLAN</w:t>
+            </w:r>
+          </w:p>
+        </w:tc>
+        <w:tc>
+          <w:tcPr>
+            <w:tcW w:w="3009" w:type="dxa"/>
+          </w:tcPr>
+          <w:p>
+            <w:r/>
+            <w:r>
+              <w:rPr>
+                <w:rFonts w:ascii="Times New Roman" w:hAnsi="Times New Roman" w:eastAsia="Times New Roman" w:cs="Times New Roman"/>
+                <w:sz w:val="22"/>
+                <w:szCs w:val="22"/>
+              </w:rPr>
+              <w:t>Solo con conflicto y alternativa viable</w:t>
+            </w:r>
+          </w:p>
+        </w:tc>
+        <w:tc>
+          <w:tcPr>
+            <w:tcW w:w="3009" w:type="dxa"/>
+          </w:tcPr>
+          <w:p>
+            <w:r/>
+            <w:r>
+              <w:rPr>
+                <w:rFonts w:ascii="Times New Roman" w:hAnsi="Times New Roman" w:eastAsia="Times New Roman" w:cs="Times New Roman"/>
+                <w:sz w:val="22"/>
+                <w:szCs w:val="22"/>
+              </w:rPr>
+              <w:t>Reglas 7-8: presentar alternativa y explicar el descarte con citas; mismo muestreo para estilo consistente.</w:t>
+            </w:r>
+          </w:p>
+        </w:tc>
+      </w:tr>
+      <w:tr>
+        <w:tc>
+          <w:tcPr>
+            <w:tcW w:w="3009" w:type="dxa"/>
+          </w:tcPr>
+          <w:p>
+            <w:r/>
+            <w:r>
+              <w:rPr>
+                <w:rFonts w:ascii="Times New Roman" w:hAnsi="Times New Roman" w:eastAsia="Times New Roman" w:cs="Times New Roman"/>
+                <w:sz w:val="22"/>
+                <w:szCs w:val="22"/>
+              </w:rPr>
+              <w:t>PLANTILLA_USUARIO</w:t>
+            </w:r>
+          </w:p>
+        </w:tc>
+        <w:tc>
+          <w:tcPr>
+            <w:tcW w:w="3009" w:type="dxa"/>
+          </w:tcPr>
+          <w:p>
+            <w:r/>
+            <w:r>
+              <w:rPr>
+                <w:rFonts w:ascii="Times New Roman" w:hAnsi="Times New Roman" w:eastAsia="Times New Roman" w:cs="Times New Roman"/>
+                <w:sz w:val="22"/>
+                <w:szCs w:val="22"/>
+              </w:rPr>
+              <w:t>Siempre (envuelve cada llamada)</w:t>
+            </w:r>
+          </w:p>
+        </w:tc>
+        <w:tc>
+          <w:tcPr>
+            <w:tcW w:w="3009" w:type="dxa"/>
+          </w:tcPr>
+          <w:p>
+            <w:r/>
+            <w:r>
+              <w:rPr>
+                <w:rFonts w:ascii="Times New Roman" w:hAnsi="Times New Roman" w:eastAsia="Times New Roman" w:cs="Times New Roman"/>
+                <w:sz w:val="22"/>
+                <w:szCs w:val="22"/>
+              </w:rPr>
+              <w:t>Ordena contexto ([F#] con fuente) + herramientas ([T#]) + pedido; sin este orden el LLM no puede citar.</w:t>
+            </w:r>
+          </w:p>
+        </w:tc>
+      </w:tr>
+    </w:tbl>
+    <w:p>
+      <w:pPr>
+        <w:spacing w:before="0" w:after="160"/>
+      </w:pPr>
+      <w:r>
+        <w:rPr>
+          <w:rFonts w:ascii="Times New Roman" w:hAnsi="Times New Roman" w:eastAsia="Times New Roman" w:cs="Times New Roman"/>
+          <w:sz w:val="22"/>
+          <w:szCs w:val="22"/>
+        </w:rPr>
+        <w:t>Muestreo fijo en agent/llm_client.py: temperature=0,2 y max_completion_tokens=1024 (regla 4: máximo 200 palabras).</w:t>
+      </w:r>
+    </w:p>
+    <w:p>
+      <w:pPr>
+        <w:pageBreakBefore/>
+      </w:pPr>
+      <w:r>
+        <w:lastRenderedPageBreak/>
+      </w:r>
+    </w:p>
+    <w:p>
+      <w:pPr>
+        <w:pStyle w:val="Heading1"/>
+        <w:spacing w:before="120" w:after="60"/>
+      </w:pPr>
+      <w:r>
+        <w:rPr>
+          <w:rFonts w:ascii="Times New Roman" w:hAnsi="Times New Roman" w:eastAsia="Times New Roman" w:cs="Times New Roman"/>
+          <w:b/>
+          <w:bCs/>
+          <w:color w:val="2E74B5"/>
           <w:sz w:val="26"/>
           <w:szCs w:val="26"/>
         </w:rPr>
-        <w:t xml:space="preserve">Pipeline RAG: Fuentes Internas y Externas</w:t>
+        <w:t>Pipeline RAG: Fuentes Internas y Externas</w:t>
       </w:r>
     </w:p>
     <w:p>
@@ -244,11 +704,11 @@
       </w:pPr>
       <w:r>
         <w:rPr>
-          <w:rFonts w:ascii="Times New Roman" w:cs="Times New Roman" w:eastAsia="Times New Roman" w:hAnsi="Times New Roman"/>
-          <w:sz w:val="22"/>
-          <w:szCs w:val="22"/>
-        </w:rPr>
-        <w:t xml:space="preserve">La base de conocimiento interna son 9 paquetes turÃ­sticos (PAQ-001 a PAQ-009, en JSON: regiÃ³n, actividad, dificultad, temporada, guÃ­a asignado, itinerario por dÃ­as con senderos) y un roster de 5 guÃ­as (GUI-001 a GUI-005) con fechas de disponibilidad en formato ISO. La ingesta (ingestion/ingest.py) divide los documentos en fragmentos de 500 caracteres con solapamiento de 50, los vectoriza con el modelo local multilingÃ¼e paraphrase-multilingual-MiniLM-L12-v2 (elegido porque el contenido estÃ¡ en espaÃ±ol) y los indexa en ChromaDB persistente (24 documentos) con metadata que permite filtros por tipo, regiÃ³n, actividad y dificultad.</w:t>
+          <w:rFonts w:ascii="Times New Roman" w:hAnsi="Times New Roman" w:eastAsia="Times New Roman" w:cs="Times New Roman"/>
+          <w:sz w:val="22"/>
+          <w:szCs w:val="22"/>
+        </w:rPr>
+        <w:t>La base de conocimiento interna son 9 paquetes turísticos (PAQ-001 a PAQ-009, en JSON: región, actividad, dificultad, temporada, guía asignado, itinerario por días con senderos) y un roster de 5 guías (GUI-001 a GUI-005) con fechas de disponibilidad en formato ISO. La ingesta (ingestion/ingest.py) divide los documentos en fragmentos de 500 caracteres con solapamiento de 50, los vectoriza con el modelo local multilingüe paraphrase-multilingual-MiniLM-L12-v2 (Reimers &amp; Gurevych, 2019; elegido porque el contenido está en español) y los indexa en ChromaDB persistente (24 documentos) con metadata que permite filtros por tipo, región, actividad y dificultad.</w:t>
       </w:r>
     </w:p>
     <w:p>
@@ -257,11 +717,11 @@
       </w:pPr>
       <w:r>
         <w:rPr>
-          <w:rFonts w:ascii="Times New Roman" w:cs="Times New Roman" w:eastAsia="Times New Roman" w:hAnsi="Times New Roman"/>
-          <w:sz w:val="22"/>
-          <w:szCs w:val="22"/>
-        </w:rPr>
-        <w:t xml:space="preserve">La recuperaciÃ³n del agente es hÃ­brida por diseÃ±o, combinando bÃºsqueda semÃ¡ntica con filtros estructurados: la consulta del cliente recupera el paquete top-1 (k=5), y cada verificaciÃ³n usa filtros de metadata exactos â€”por ejemplo, el Replanificador reconsulta con k=8 y descarta el paquete conflictado. Las fuentes externas se integran como herramientas dentro del loop, no como documentos del Ã­ndice: el clima real se obtiene de Open-Meteo (sin API key; fuera del rango de pronÃ³stico devuelve disponible=False sin inventar datos) y el estado de 14 senderos desde un archivo externo que replica la consulta al sistema de CONAF. La disponibilidad de guÃ­as se expone como tercera herramienta que consulta el roster interno y responde solo con fechas exactas.</w:t>
+          <w:rFonts w:ascii="Times New Roman" w:hAnsi="Times New Roman" w:eastAsia="Times New Roman" w:cs="Times New Roman"/>
+          <w:sz w:val="22"/>
+          <w:szCs w:val="22"/>
+        </w:rPr>
+        <w:t>La recuperación del agente es híbrida por diseño, combinando búsqueda semántica con filtros estructurados: la consulta del cliente recupera el paquete top-1 (k=5), y cada verificación usa filtros de metadata exactos —por ejemplo, el Replanificador reconsulta con k=8 y descarta el paquete conflictado. Las fuentes externas se integran como herramientas dentro del loop, no como documentos del índice: el clima real se obtiene de Open-Meteo (Open-Meteo, 2026; sin API key; fuera del rango de pronóstico devuelve disponible=False sin inventar datos) y el estado de 14 senderos desde un archivo externo que replica la consulta al sistema de CONAF. La disponibilidad de guías se expone como tercera herramienta que consulta el roster interno y responde solo con fechas exactas.</w:t>
       </w:r>
     </w:p>
     <w:p>
@@ -270,27 +730,27 @@
       </w:pPr>
       <w:r>
         <w:rPr>
-          <w:rFonts w:ascii="Times New Roman" w:cs="Times New Roman" w:eastAsia="Times New Roman" w:hAnsi="Times New Roman"/>
-          <w:sz w:val="22"/>
-          <w:szCs w:val="22"/>
-        </w:rPr>
-        <w:t xml:space="preserve">El flujo de informaciÃ³n es: pedido del cliente â†’ RAG (paquete candidato) â†’ verificaciÃ³n secuencial de senderos, clima y guÃ­a â†’ si todo calza, respuesta con citas; si hay conflicto, el Replanificador reconsulta y evalÃºa candidatos (temporada, senderos, clima, guÃ­a) â†’ el LLM redacta el itinerario final citando cada decisiÃ³n. La tabla 1 resume las decisiones de implementaciÃ³n del pipeline.</w:t>
-      </w:r>
-    </w:p>
-    <w:p>
-      <w:pPr>
-        <w:spacing w:after="40" w:before="120" w:line="264"/>
+          <w:rFonts w:ascii="Times New Roman" w:hAnsi="Times New Roman" w:eastAsia="Times New Roman" w:cs="Times New Roman"/>
+          <w:sz w:val="22"/>
+          <w:szCs w:val="22"/>
+        </w:rPr>
+        <w:t>El flujo de información es: pedido del cliente → RAG (paquete candidato) → verificación secuencial de senderos, clima y guía → si todo calza, respuesta con citas; si hay conflicto, el Replanificador reconsulta y evalúa candidatos (temporada, senderos, clima, guía) → el LLM redacta el itinerario final citando cada decisión. La tabla 1 resume las decisiones de implementación del pipeline.</w:t>
+      </w:r>
+    </w:p>
+    <w:p>
+      <w:pPr>
+        <w:spacing w:before="120" w:after="40" w:line="264"/>
         <w:jc w:val="center"/>
       </w:pPr>
       <w:r>
         <w:rPr>
-          <w:rFonts w:ascii="Times New Roman" w:cs="Times New Roman" w:eastAsia="Times New Roman" w:hAnsi="Times New Roman"/>
+          <w:rFonts w:ascii="Times New Roman" w:hAnsi="Times New Roman" w:eastAsia="Times New Roman" w:cs="Times New Roman"/>
           <w:b/>
           <w:bCs/>
           <w:sz w:val="22"/>
           <w:szCs w:val="22"/>
         </w:rPr>
-        <w:t xml:space="preserve">Tabla 1</w:t>
+        <w:t>Tabla 1</w:t>
       </w:r>
     </w:p>
     <w:p>
@@ -300,25 +760,25 @@
       </w:pPr>
       <w:r>
         <w:rPr>
-          <w:rFonts w:ascii="Times New Roman" w:cs="Times New Roman" w:eastAsia="Times New Roman" w:hAnsi="Times New Roman"/>
+          <w:rFonts w:ascii="Times New Roman" w:hAnsi="Times New Roman" w:eastAsia="Times New Roman" w:cs="Times New Roman"/>
           <w:i/>
           <w:iCs/>
           <w:sz w:val="22"/>
           <w:szCs w:val="22"/>
         </w:rPr>
-        <w:t xml:space="preserve">Decisiones de implementaciÃ³n del pipeline RAG</w:t>
+        <w:t>Decisiones de implementación del pipeline RAG</w:t>
       </w:r>
     </w:p>
     <w:tbl>
       <w:tblPr>
-        <w:tblW w:type="dxa" w:w="9026"/>
+        <w:tblW w:w="9026" w:type="dxa"/>
         <w:tblBorders>
-          <w:top w:val="single" w:color="auto" w:sz="4"/>
-          <w:left w:val="single" w:color="auto" w:sz="4"/>
-          <w:bottom w:val="single" w:color="auto" w:sz="4"/>
-          <w:right w:val="single" w:color="auto" w:sz="4"/>
-          <w:insideH w:val="single" w:color="auto" w:sz="4"/>
-          <w:insideV w:val="single" w:color="auto" w:sz="4"/>
+          <w:top w:val="single" w:sz="4" w:color="auto"/>
+          <w:left w:val="single" w:sz="4" w:color="auto"/>
+          <w:bottom w:val="single" w:sz="4" w:color="auto"/>
+          <w:right w:val="single" w:sz="4" w:color="auto"/>
+          <w:insideH w:val="single" w:sz="4" w:color="auto"/>
+          <w:insideV w:val="single" w:sz="4" w:color="auto"/>
         </w:tblBorders>
       </w:tblPr>
       <w:tblGrid>
@@ -328,13 +788,19 @@
       <w:tr>
         <w:tc>
           <w:tcPr>
-            <w:tcW w:type="dxa" w:w="2800"/>
-            <w:shd w:fill="F2F2F2" w:val="clear"/>
+            <w:tcW w:w="2800" w:type="dxa"/>
+            <w:tcBorders>
+              <w:top w:val="single" w:sz="4" w:color="auto"/>
+              <w:left w:val="single" w:sz="4" w:color="auto"/>
+              <w:bottom w:val="single" w:sz="4" w:color="auto"/>
+              <w:right w:val="single" w:sz="4" w:color="auto"/>
+            </w:tcBorders>
+            <w:shd w:val="clear" w:fill="F2F2F2"/>
             <w:tcMar>
-              <w:top w:type="dxa" w:w="40"/>
-              <w:left w:type="dxa" w:w="80"/>
-              <w:bottom w:type="dxa" w:w="40"/>
-              <w:right w:type="dxa" w:w="80"/>
+              <w:top w:w="40" w:type="dxa"/>
+              <w:left w:w="80" w:type="dxa"/>
+              <w:bottom w:w="40" w:type="dxa"/>
+              <w:right w:w="80" w:type="dxa"/>
             </w:tcMar>
           </w:tcPr>
           <w:p>
@@ -344,25 +810,31 @@
             </w:pPr>
             <w:r>
               <w:rPr>
-                <w:rFonts w:ascii="Times New Roman" w:cs="Times New Roman" w:eastAsia="Times New Roman" w:hAnsi="Times New Roman"/>
+                <w:rFonts w:ascii="Times New Roman" w:hAnsi="Times New Roman" w:eastAsia="Times New Roman" w:cs="Times New Roman"/>
                 <w:b/>
                 <w:bCs/>
                 <w:sz w:val="20"/>
                 <w:szCs w:val="20"/>
               </w:rPr>
-              <w:t xml:space="preserve">DecisiÃ³n</w:t>
-            </w:r>
-          </w:p>
-        </w:tc>
-        <w:tc>
-          <w:tcPr>
-            <w:tcW w:type="dxa" w:w="6226"/>
-            <w:shd w:fill="F2F2F2" w:val="clear"/>
+              <w:t>Decisión</w:t>
+            </w:r>
+          </w:p>
+        </w:tc>
+        <w:tc>
+          <w:tcPr>
+            <w:tcW w:w="6226" w:type="dxa"/>
+            <w:tcBorders>
+              <w:top w:val="single" w:sz="4" w:color="auto"/>
+              <w:left w:val="single" w:sz="4" w:color="auto"/>
+              <w:bottom w:val="single" w:sz="4" w:color="auto"/>
+              <w:right w:val="single" w:sz="4" w:color="auto"/>
+            </w:tcBorders>
+            <w:shd w:val="clear" w:fill="F2F2F2"/>
             <w:tcMar>
-              <w:top w:type="dxa" w:w="40"/>
-              <w:left w:type="dxa" w:w="80"/>
-              <w:bottom w:type="dxa" w:w="40"/>
-              <w:right w:type="dxa" w:w="80"/>
+              <w:top w:w="40" w:type="dxa"/>
+              <w:left w:w="80" w:type="dxa"/>
+              <w:bottom w:w="40" w:type="dxa"/>
+              <w:right w:w="80" w:type="dxa"/>
             </w:tcMar>
           </w:tcPr>
           <w:p>
@@ -372,13 +844,13 @@
             </w:pPr>
             <w:r>
               <w:rPr>
-                <w:rFonts w:ascii="Times New Roman" w:cs="Times New Roman" w:eastAsia="Times New Roman" w:hAnsi="Times New Roman"/>
+                <w:rFonts w:ascii="Times New Roman" w:hAnsi="Times New Roman" w:eastAsia="Times New Roman" w:cs="Times New Roman"/>
                 <w:b/>
                 <w:bCs/>
                 <w:sz w:val="20"/>
                 <w:szCs w:val="20"/>
               </w:rPr>
-              <w:t xml:space="preserve">JustificaciÃ³n</w:t>
+              <w:t>Justificación</w:t>
             </w:r>
           </w:p>
         </w:tc>
@@ -386,12 +858,18 @@
       <w:tr>
         <w:tc>
           <w:tcPr>
-            <w:tcW w:type="dxa" w:w="2800"/>
+            <w:tcW w:w="2800" w:type="dxa"/>
+            <w:tcBorders>
+              <w:top w:val="single" w:sz="4" w:color="auto"/>
+              <w:left w:val="single" w:sz="4" w:color="auto"/>
+              <w:bottom w:val="single" w:sz="4" w:color="auto"/>
+              <w:right w:val="single" w:sz="4" w:color="auto"/>
+            </w:tcBorders>
             <w:tcMar>
-              <w:top w:type="dxa" w:w="40"/>
-              <w:left w:type="dxa" w:w="80"/>
-              <w:bottom w:type="dxa" w:w="40"/>
-              <w:right w:type="dxa" w:w="80"/>
+              <w:top w:w="40" w:type="dxa"/>
+              <w:left w:w="80" w:type="dxa"/>
+              <w:bottom w:w="40" w:type="dxa"/>
+              <w:right w:w="80" w:type="dxa"/>
             </w:tcMar>
           </w:tcPr>
           <w:p>
@@ -401,24 +879,28 @@
             </w:pPr>
             <w:r>
               <w:rPr>
-                <w:rFonts w:ascii="Times New Roman" w:cs="Times New Roman" w:eastAsia="Times New Roman" w:hAnsi="Times New Roman"/>
-                <w:b w:val="false"/>
-                <w:bCs w:val="false"/>
+                <w:rFonts w:ascii="Times New Roman" w:hAnsi="Times New Roman" w:eastAsia="Times New Roman" w:cs="Times New Roman"/>
                 <w:sz w:val="20"/>
                 <w:szCs w:val="20"/>
               </w:rPr>
-              <w:t xml:space="preserve">ChromaDB persistente con filtros de metadata</w:t>
-            </w:r>
-          </w:p>
-        </w:tc>
-        <w:tc>
-          <w:tcPr>
-            <w:tcW w:type="dxa" w:w="6226"/>
+              <w:t>ChromaDB persistente con filtros de metadata</w:t>
+            </w:r>
+          </w:p>
+        </w:tc>
+        <w:tc>
+          <w:tcPr>
+            <w:tcW w:w="6226" w:type="dxa"/>
+            <w:tcBorders>
+              <w:top w:val="single" w:sz="4" w:color="auto"/>
+              <w:left w:val="single" w:sz="4" w:color="auto"/>
+              <w:bottom w:val="single" w:sz="4" w:color="auto"/>
+              <w:right w:val="single" w:sz="4" w:color="auto"/>
+            </w:tcBorders>
             <w:tcMar>
-              <w:top w:type="dxa" w:w="40"/>
-              <w:left w:type="dxa" w:w="80"/>
-              <w:bottom w:type="dxa" w:w="40"/>
-              <w:right w:type="dxa" w:w="80"/>
+              <w:top w:w="40" w:type="dxa"/>
+              <w:left w:w="80" w:type="dxa"/>
+              <w:bottom w:w="40" w:type="dxa"/>
+              <w:right w:w="80" w:type="dxa"/>
             </w:tcMar>
           </w:tcPr>
           <w:p>
@@ -428,13 +910,11 @@
             </w:pPr>
             <w:r>
               <w:rPr>
-                <w:rFonts w:ascii="Times New Roman" w:cs="Times New Roman" w:eastAsia="Times New Roman" w:hAnsi="Times New Roman"/>
-                <w:b w:val="false"/>
-                <w:bCs w:val="false"/>
+                <w:rFonts w:ascii="Times New Roman" w:hAnsi="Times New Roman" w:eastAsia="Times New Roman" w:cs="Times New Roman"/>
                 <w:sz w:val="20"/>
                 <w:szCs w:val="20"/>
               </w:rPr>
-              <w:t xml:space="preserve">Filtrado estructurado por regiÃ³n/actividad/dificultad, requisito del caso; FAISS ofrece solo bÃºsqueda vectorial plana</w:t>
+              <w:t>Filtrado estructurado por región/actividad/dificultad, requisito del caso; FAISS ofrece solo búsqueda vectorial plana</w:t>
             </w:r>
           </w:p>
         </w:tc>
@@ -442,12 +922,18 @@
       <w:tr>
         <w:tc>
           <w:tcPr>
-            <w:tcW w:type="dxa" w:w="2800"/>
+            <w:tcW w:w="2800" w:type="dxa"/>
+            <w:tcBorders>
+              <w:top w:val="single" w:sz="4" w:color="auto"/>
+              <w:left w:val="single" w:sz="4" w:color="auto"/>
+              <w:bottom w:val="single" w:sz="4" w:color="auto"/>
+              <w:right w:val="single" w:sz="4" w:color="auto"/>
+            </w:tcBorders>
             <w:tcMar>
-              <w:top w:type="dxa" w:w="40"/>
-              <w:left w:type="dxa" w:w="80"/>
-              <w:bottom w:type="dxa" w:w="40"/>
-              <w:right w:type="dxa" w:w="80"/>
+              <w:top w:w="40" w:type="dxa"/>
+              <w:left w:w="80" w:type="dxa"/>
+              <w:bottom w:w="40" w:type="dxa"/>
+              <w:right w:w="80" w:type="dxa"/>
             </w:tcMar>
           </w:tcPr>
           <w:p>
@@ -457,24 +943,28 @@
             </w:pPr>
             <w:r>
               <w:rPr>
-                <w:rFonts w:ascii="Times New Roman" w:cs="Times New Roman" w:eastAsia="Times New Roman" w:hAnsi="Times New Roman"/>
-                <w:b w:val="false"/>
-                <w:bCs w:val="false"/>
+                <w:rFonts w:ascii="Times New Roman" w:hAnsi="Times New Roman" w:eastAsia="Times New Roman" w:cs="Times New Roman"/>
                 <w:sz w:val="20"/>
                 <w:szCs w:val="20"/>
               </w:rPr>
-              <w:t xml:space="preserve">Embeddings locales MiniLM-L12-v2</w:t>
-            </w:r>
-          </w:p>
-        </w:tc>
-        <w:tc>
-          <w:tcPr>
-            <w:tcW w:type="dxa" w:w="6226"/>
+              <w:t>Embeddings locales MiniLM-L12-v2</w:t>
+            </w:r>
+          </w:p>
+        </w:tc>
+        <w:tc>
+          <w:tcPr>
+            <w:tcW w:w="6226" w:type="dxa"/>
+            <w:tcBorders>
+              <w:top w:val="single" w:sz="4" w:color="auto"/>
+              <w:left w:val="single" w:sz="4" w:color="auto"/>
+              <w:bottom w:val="single" w:sz="4" w:color="auto"/>
+              <w:right w:val="single" w:sz="4" w:color="auto"/>
+            </w:tcBorders>
             <w:tcMar>
-              <w:top w:type="dxa" w:w="40"/>
-              <w:left w:type="dxa" w:w="80"/>
-              <w:bottom w:type="dxa" w:w="40"/>
-              <w:right w:type="dxa" w:w="80"/>
+              <w:top w:w="40" w:type="dxa"/>
+              <w:left w:w="80" w:type="dxa"/>
+              <w:bottom w:w="40" w:type="dxa"/>
+              <w:right w:w="80" w:type="dxa"/>
             </w:tcMar>
           </w:tcPr>
           <w:p>
@@ -484,13 +974,11 @@
             </w:pPr>
             <w:r>
               <w:rPr>
-                <w:rFonts w:ascii="Times New Roman" w:cs="Times New Roman" w:eastAsia="Times New Roman" w:hAnsi="Times New Roman"/>
-                <w:b w:val="false"/>
-                <w:bCs w:val="false"/>
+                <w:rFonts w:ascii="Times New Roman" w:hAnsi="Times New Roman" w:eastAsia="Times New Roman" w:cs="Times New Roman"/>
                 <w:sz w:val="20"/>
                 <w:szCs w:val="20"/>
               </w:rPr>
-              <w:t xml:space="preserve">Corpus en espaÃ±ol; costo cero y datos privados frente a APIs de embeddings</w:t>
+              <w:t>Corpus en español; costo cero y datos privados frente a APIs de embeddings</w:t>
             </w:r>
           </w:p>
         </w:tc>
@@ -498,12 +986,18 @@
       <w:tr>
         <w:tc>
           <w:tcPr>
-            <w:tcW w:type="dxa" w:w="2800"/>
+            <w:tcW w:w="2800" w:type="dxa"/>
+            <w:tcBorders>
+              <w:top w:val="single" w:sz="4" w:color="auto"/>
+              <w:left w:val="single" w:sz="4" w:color="auto"/>
+              <w:bottom w:val="single" w:sz="4" w:color="auto"/>
+              <w:right w:val="single" w:sz="4" w:color="auto"/>
+            </w:tcBorders>
             <w:tcMar>
-              <w:top w:type="dxa" w:w="40"/>
-              <w:left w:type="dxa" w:w="80"/>
-              <w:bottom w:type="dxa" w:w="40"/>
-              <w:right w:type="dxa" w:w="80"/>
+              <w:top w:w="40" w:type="dxa"/>
+              <w:left w:w="80" w:type="dxa"/>
+              <w:bottom w:w="40" w:type="dxa"/>
+              <w:right w:w="80" w:type="dxa"/>
             </w:tcMar>
           </w:tcPr>
           <w:p>
@@ -513,24 +1007,28 @@
             </w:pPr>
             <w:r>
               <w:rPr>
-                <w:rFonts w:ascii="Times New Roman" w:cs="Times New Roman" w:eastAsia="Times New Roman" w:hAnsi="Times New Roman"/>
-                <w:b w:val="false"/>
-                <w:bCs w:val="false"/>
+                <w:rFonts w:ascii="Times New Roman" w:hAnsi="Times New Roman" w:eastAsia="Times New Roman" w:cs="Times New Roman"/>
                 <w:sz w:val="20"/>
                 <w:szCs w:val="20"/>
               </w:rPr>
-              <w:t xml:space="preserve">Chunking 500/50 por pÃ¡rrafos</w:t>
-            </w:r>
-          </w:p>
-        </w:tc>
-        <w:tc>
-          <w:tcPr>
-            <w:tcW w:type="dxa" w:w="6226"/>
+              <w:t>Chunking 500/50 por párrafos</w:t>
+            </w:r>
+          </w:p>
+        </w:tc>
+        <w:tc>
+          <w:tcPr>
+            <w:tcW w:w="6226" w:type="dxa"/>
+            <w:tcBorders>
+              <w:top w:val="single" w:sz="4" w:color="auto"/>
+              <w:left w:val="single" w:sz="4" w:color="auto"/>
+              <w:bottom w:val="single" w:sz="4" w:color="auto"/>
+              <w:right w:val="single" w:sz="4" w:color="auto"/>
+            </w:tcBorders>
             <w:tcMar>
-              <w:top w:type="dxa" w:w="40"/>
-              <w:left w:type="dxa" w:w="80"/>
-              <w:bottom w:type="dxa" w:w="40"/>
-              <w:right w:type="dxa" w:w="80"/>
+              <w:top w:w="40" w:type="dxa"/>
+              <w:left w:w="80" w:type="dxa"/>
+              <w:bottom w:w="40" w:type="dxa"/>
+              <w:right w:w="80" w:type="dxa"/>
             </w:tcMar>
           </w:tcPr>
           <w:p>
@@ -540,13 +1038,11 @@
             </w:pPr>
             <w:r>
               <w:rPr>
-                <w:rFonts w:ascii="Times New Roman" w:cs="Times New Roman" w:eastAsia="Times New Roman" w:hAnsi="Times New Roman"/>
-                <w:b w:val="false"/>
-                <w:bCs w:val="false"/>
+                <w:rFonts w:ascii="Times New Roman" w:hAnsi="Times New Roman" w:eastAsia="Times New Roman" w:cs="Times New Roman"/>
                 <w:sz w:val="20"/>
                 <w:szCs w:val="20"/>
               </w:rPr>
-              <w:t xml:space="preserve">Visto en clases; paquetes son documentos cortos con secciones (itinerario por dÃ­a)</w:t>
+              <w:t>Visto en clases; paquetes son documentos cortos con secciones (itinerario por día)</w:t>
             </w:r>
           </w:p>
         </w:tc>
@@ -554,12 +1050,18 @@
       <w:tr>
         <w:tc>
           <w:tcPr>
-            <w:tcW w:type="dxa" w:w="2800"/>
+            <w:tcW w:w="2800" w:type="dxa"/>
+            <w:tcBorders>
+              <w:top w:val="single" w:sz="4" w:color="auto"/>
+              <w:left w:val="single" w:sz="4" w:color="auto"/>
+              <w:bottom w:val="single" w:sz="4" w:color="auto"/>
+              <w:right w:val="single" w:sz="4" w:color="auto"/>
+            </w:tcBorders>
             <w:tcMar>
-              <w:top w:type="dxa" w:w="40"/>
-              <w:left w:type="dxa" w:w="80"/>
-              <w:bottom w:type="dxa" w:w="40"/>
-              <w:right w:type="dxa" w:w="80"/>
+              <w:top w:w="40" w:type="dxa"/>
+              <w:left w:w="80" w:type="dxa"/>
+              <w:bottom w:w="40" w:type="dxa"/>
+              <w:right w:w="80" w:type="dxa"/>
             </w:tcMar>
           </w:tcPr>
           <w:p>
@@ -569,24 +1071,28 @@
             </w:pPr>
             <w:r>
               <w:rPr>
-                <w:rFonts w:ascii="Times New Roman" w:cs="Times New Roman" w:eastAsia="Times New Roman" w:hAnsi="Times New Roman"/>
-                <w:b w:val="false"/>
-                <w:bCs w:val="false"/>
+                <w:rFonts w:ascii="Times New Roman" w:hAnsi="Times New Roman" w:eastAsia="Times New Roman" w:cs="Times New Roman"/>
                 <w:sz w:val="20"/>
                 <w:szCs w:val="20"/>
               </w:rPr>
-              <w:t xml:space="preserve">Fuentes externas como tools, no como Ã­ndice</w:t>
-            </w:r>
-          </w:p>
-        </w:tc>
-        <w:tc>
-          <w:tcPr>
-            <w:tcW w:type="dxa" w:w="6226"/>
+              <w:t>Fuentes externas como tools, no como índice</w:t>
+            </w:r>
+          </w:p>
+        </w:tc>
+        <w:tc>
+          <w:tcPr>
+            <w:tcW w:w="6226" w:type="dxa"/>
+            <w:tcBorders>
+              <w:top w:val="single" w:sz="4" w:color="auto"/>
+              <w:left w:val="single" w:sz="4" w:color="auto"/>
+              <w:bottom w:val="single" w:sz="4" w:color="auto"/>
+              <w:right w:val="single" w:sz="4" w:color="auto"/>
+            </w:tcBorders>
             <w:tcMar>
-              <w:top w:type="dxa" w:w="40"/>
-              <w:left w:type="dxa" w:w="80"/>
-              <w:bottom w:type="dxa" w:w="40"/>
-              <w:right w:type="dxa" w:w="80"/>
+              <w:top w:w="40" w:type="dxa"/>
+              <w:left w:w="80" w:type="dxa"/>
+              <w:bottom w:w="40" w:type="dxa"/>
+              <w:right w:w="80" w:type="dxa"/>
             </w:tcMar>
           </w:tcPr>
           <w:p>
@@ -596,37 +1102,93 @@
             </w:pPr>
             <w:r>
               <w:rPr>
-                <w:rFonts w:ascii="Times New Roman" w:cs="Times New Roman" w:eastAsia="Times New Roman" w:hAnsi="Times New Roman"/>
-                <w:b w:val="false"/>
-                <w:bCs w:val="false"/>
+                <w:rFonts w:ascii="Times New Roman" w:hAnsi="Times New Roman" w:eastAsia="Times New Roman" w:cs="Times New Roman"/>
                 <w:sz w:val="20"/>
                 <w:szCs w:val="20"/>
               </w:rPr>
-              <w:t xml:space="preserve">Clima y disponibilidad cambian a diario; deben consultarse en vivo en cada respuesta, no cachearse en el Ã­ndice</w:t>
+              <w:t>Clima y disponibilidad cambian a diario; deben consultarse en vivo en cada respuesta, no cachearse en el índice</w:t>
             </w:r>
           </w:p>
         </w:tc>
       </w:tr>
     </w:tbl>
     <w:p>
-      <w:r>
-        <w:br w:type="page"/>
+      <w:pPr>
+        <w:spacing w:before="0" w:after="160"/>
+      </w:pPr>
+      <w:r>
+        <w:rPr>
+          <w:rFonts w:ascii="Times New Roman" w:hAnsi="Times New Roman" w:eastAsia="Times New Roman" w:cs="Times New Roman"/>
+          <w:i/>
+          <w:iCs/>
+          <w:sz w:val="22"/>
+          <w:szCs w:val="22"/>
+        </w:rPr>
+        <w:t>Extracto de trazabilidad — caso E04, trekking en Torres del Paine, 2026-12-08 (main.py --pasos --falso; pasos renumerados).</w:t>
+      </w:r>
+    </w:p>
+    <w:p>
+      <w:pPr>
+        <w:spacing w:before="0" w:after="0"/>
+      </w:pPr>
+      <w:r>
+        <w:rPr>
+          <w:rFonts w:ascii="Times New Roman" w:hAnsi="Times New Roman" w:eastAsia="Times New Roman" w:cs="Times New Roman"/>
+          <w:sz w:val="22"/>
+          <w:szCs w:val="22"/>
+        </w:rPr>
+        <w:t>• «Sendero cerrado: senda-base-torres (bloqueo por nieve…)» → paso herramienta estado_sendero (salida: cerrado) + fuente [T#] trail_status.json (simulada).</w:t>
+      </w:r>
+    </w:p>
+    <w:p>
+      <w:pPr>
+        <w:spacing w:before="0" w:after="0"/>
+      </w:pPr>
+      <w:r>
+        <w:rPr>
+          <w:rFonts w:ascii="Times New Roman" w:hAnsi="Times New Roman" w:eastAsia="Times New Roman" w:cs="Times New Roman"/>
+          <w:sz w:val="22"/>
+          <w:szCs w:val="22"/>
+        </w:rPr>
+        <w:t>• «Replanificación PAQ-002 → PAQ-009» → paso replanificacion (origen PAQ-002, destino PAQ-009, «candidato viable en evaluación 3 de 5») tras reconsulta RAG k=8.</w:t>
+      </w:r>
+    </w:p>
+    <w:p>
+      <w:pPr>
+        <w:spacing w:before="0" w:after="160"/>
+      </w:pPr>
+      <w:r>
+        <w:rPr>
+          <w:rFonts w:ascii="Times New Roman" w:hAnsi="Times New Roman" w:eastAsia="Times New Roman" w:cs="Times New Roman"/>
+          <w:sz w:val="22"/>
+          <w:szCs w:val="22"/>
+        </w:rPr>
+        <w:t>• «PAQ-009 viable» → senderos abiertos, guía GUI-004 disponible, clima no disponible (fuera de rango Open-Meteo) + cita [F#] PAQ-009.</w:t>
+      </w:r>
+    </w:p>
+    <w:p>
+      <w:pPr>
+        <w:pageBreakBefore/>
+      </w:pPr>
+      <w:r>
+        <w:lastRenderedPageBreak/>
       </w:r>
     </w:p>
     <w:p>
       <w:pPr>
         <w:pStyle w:val="Heading1"/>
-        <w:spacing w:after="60" w:before="120"/>
-      </w:pPr>
-      <w:r>
-        <w:rPr>
-          <w:rFonts w:ascii="Times New Roman" w:cs="Times New Roman" w:eastAsia="Times New Roman" w:hAnsi="Times New Roman"/>
+        <w:spacing w:before="120" w:after="60"/>
+      </w:pPr>
+      <w:r>
+        <w:rPr>
+          <w:rFonts w:ascii="Times New Roman" w:hAnsi="Times New Roman" w:eastAsia="Times New Roman" w:cs="Times New Roman"/>
           <w:b/>
           <w:bCs/>
+          <w:color w:val="2E74B5"/>
           <w:sz w:val="26"/>
           <w:szCs w:val="26"/>
         </w:rPr>
-        <w:t xml:space="preserve">Arquitectura de la SoluciÃ³n</w:t>
+        <w:t>Arquitectura de la Solución</w:t>
       </w:r>
     </w:p>
     <w:p>
@@ -635,27 +1197,27 @@
       </w:pPr>
       <w:r>
         <w:rPr>
-          <w:rFonts w:ascii="Times New Roman" w:cs="Times New Roman" w:eastAsia="Times New Roman" w:hAnsi="Times New Roman"/>
-          <w:sz w:val="22"/>
-          <w:szCs w:val="22"/>
-        </w:rPr>
-        <w:t xml:space="preserve">La Figura 1 presenta la arquitectura. El nÃºcleo es un loop de razonamiento-acciÃ³n propio (agent/reasoning_loop.py) que orquesta: recuperaciÃ³n RAG, llamadas a herramientas de verificaciÃ³n, el mÃ³dulo Replanificador ante conflictos, y la generaciÃ³n final del LLM. Cada paso se registra en un log de trazabilidad JSONL (logs/trace.jsonl) con paso, tipo de evento y hora UTC: quÃ© recuperÃ³, quÃ© herramienta llamÃ³, por quÃ© replanificÃ³ y quÃ© fuente respalda cada afirmaciÃ³n.</w:t>
-      </w:r>
-    </w:p>
-    <w:p>
-      <w:pPr>
-        <w:spacing w:after="40" w:before="60" w:line="264"/>
+          <w:rFonts w:ascii="Times New Roman" w:hAnsi="Times New Roman" w:eastAsia="Times New Roman" w:cs="Times New Roman"/>
+          <w:sz w:val="22"/>
+          <w:szCs w:val="22"/>
+        </w:rPr>
+        <w:t>La Figura 1 presenta la arquitectura. El núcleo es un loop de razonamiento-acción propio tipo ReAct (Yao et al., 2023) (agent/reasoning_loop.py) que orquesta: recuperación RAG, llamadas a herramientas de verificación, el módulo Replanificador ante conflictos, y la generación final del LLM. Cada paso se registra en un log de trazabilidad JSONL (logs/trace.jsonl) con paso, tipo de evento y hora UTC: qué recuperó, qué herramienta llamó, por qué replanificó y qué fuente respalda cada afirmación.</w:t>
+      </w:r>
+    </w:p>
+    <w:p>
+      <w:pPr>
+        <w:spacing w:before="60" w:after="40" w:line="264"/>
         <w:jc w:val="center"/>
       </w:pPr>
       <w:r>
         <w:rPr>
-          <w:rFonts w:ascii="Times New Roman" w:cs="Times New Roman" w:eastAsia="Times New Roman" w:hAnsi="Times New Roman"/>
+          <w:rFonts w:ascii="Times New Roman" w:hAnsi="Times New Roman" w:eastAsia="Times New Roman" w:cs="Times New Roman"/>
           <w:b/>
           <w:bCs/>
           <w:sz w:val="22"/>
           <w:szCs w:val="22"/>
         </w:rPr>
-        <w:t xml:space="preserve">Figura 1</w:t>
+        <w:t>Figura 1</w:t>
       </w:r>
     </w:p>
     <w:p>
@@ -665,46 +1227,56 @@
       </w:pPr>
       <w:r>
         <w:rPr>
-          <w:rFonts w:ascii="Times New Roman" w:cs="Times New Roman" w:eastAsia="Times New Roman" w:hAnsi="Times New Roman"/>
+          <w:rFonts w:ascii="Times New Roman" w:hAnsi="Times New Roman" w:eastAsia="Times New Roman" w:cs="Times New Roman"/>
           <w:i/>
           <w:iCs/>
           <w:sz w:val="22"/>
           <w:szCs w:val="22"/>
         </w:rPr>
-        <w:t xml:space="preserve">Arquitectura del agente replanificador</w:t>
-      </w:r>
-    </w:p>
-    <w:p>
-      <w:pPr>
-        <w:pBdr>
-          <w:top w:val="single" w:color="BBBBBB" w:sz="4"/>
-          <w:bottom w:val="single" w:color="BBBBBB" w:sz="4"/>
-          <w:left w:val="single" w:color="BBBBBB" w:sz="4"/>
-          <w:right w:val="single" w:color="BBBBBB" w:sz="4"/>
-        </w:pBdr>
-        <w:shd w:fill="F2F2F2" w:val="clear"/>
+        <w:t>Arquitectura del agente replanificador</w:t>
+      </w:r>
+    </w:p>
+    <w:p>
+      <w:pPr>
         <w:spacing w:after="60"/>
-      </w:pPr>
-      <w:r>
-        <w:rPr>
-          <w:rFonts w:ascii="Consolas" w:cs="Consolas" w:eastAsia="Consolas" w:hAnsi="Consolas"/>
-          <w:sz w:val="13"/>
-          <w:szCs w:val="13"/>
-        </w:rPr>
-        <w:t xml:space="preserve">flowchart TD
-    A["Pedido del cliente&lt;br/&gt;actividad + fecha"] --&gt; B["Recuperador RAG&lt;br/&gt;paquete top-1 (ChromaDB)"]
-    B --&gt; C1["VerificaciÃ³n senderos&lt;br/&gt;trail_status.json"]
-    B --&gt; C2["VerificaciÃ³n clima&lt;br/&gt;Open-Meteo"]
-    B --&gt; C3["VerificaciÃ³n guÃ­a&lt;br/&gt;roster de disponibilidad"]
-    C1 &amp; C2 &amp; C3 --&gt; D{"Â¿Conflicto?"}
-    D -- "no" --&gt; J["LLM (Groq) + SISTEMA_BASE&lt;br/&gt;itinerario con citas F#/T#"]
-    D -- "sÃ­" --&gt; R["Replanificador&lt;br/&gt;reconsulta k=8 y evalÃºa&lt;br/&gt;temporada + senderos + clima + guÃ­a"]
-    R --&gt; Q{"Â¿Alternativa viable?"}
-    Q -- "sÃ­" --&gt; L["LLM + SISTEMA_REPLAN&lt;br/&gt;explica cambio y cita fuentes"]
-    Q -- "no" --&gt; M["Respuesta honesta&lt;br/&gt;sin alternativa inventada"]
-    J --&gt; N["Itinerario final +&lt;br/&gt;trace.jsonl por paso"]
-    L --&gt; N
-    M --&gt; N</w:t>
+        <w:jc w:val="center"/>
+      </w:pPr>
+      <w:r>
+        <w:drawing>
+          <wp:inline distT="0" distB="0" distL="0" distR="0">
+            <wp:extent cx="5486400" cy="4162425"/>
+            <wp:effectExtent l="0" t="0" r="0" b="0"/>
+            <wp:docPr id="100000" name="Picture 100000"/>
+            <wp:cNvGraphicFramePr>
+              <a:graphicFrameLocks xmlns:a="http://schemas.openxmlformats.org/drawingml/2006/main" noChangeAspect="1"/>
+            </wp:cNvGraphicFramePr>
+            <a:graphic xmlns:a="http://schemas.openxmlformats.org/drawingml/2006/main">
+              <a:graphicData uri="http://schemas.openxmlformats.org/drawingml/2006/picture">
+                <pic:pic xmlns:pic="http://schemas.openxmlformats.org/drawingml/2006/picture">
+                  <pic:nvPicPr>
+                    <pic:cNvPr id="100000" name="image100000"/>
+                    <pic:cNvPicPr/>
+                  </pic:nvPicPr>
+                  <pic:blipFill>
+                    <a:blip r:embed="rId101"/>
+                    <a:stretch>
+                      <a:fillRect/>
+                    </a:stretch>
+                  </pic:blipFill>
+                  <pic:spPr>
+                    <a:xfrm>
+                      <a:off x="0" y="0"/>
+                      <a:ext cx="5486400" cy="4162425"/>
+                    </a:xfrm>
+                    <a:prstGeom prst="rect">
+                      <a:avLst/>
+                    </a:prstGeom>
+                  </pic:spPr>
+                </pic:pic>
+              </a:graphicData>
+            </a:graphic>
+          </wp:inline>
+        </w:drawing>
       </w:r>
     </w:p>
     <w:p>
@@ -714,13 +1286,13 @@
       </w:pPr>
       <w:r>
         <w:rPr>
-          <w:rFonts w:ascii="Times New Roman" w:cs="Times New Roman" w:eastAsia="Times New Roman" w:hAnsi="Times New Roman"/>
+          <w:rFonts w:ascii="Times New Roman" w:hAnsi="Times New Roman" w:eastAsia="Times New Roman" w:cs="Times New Roman"/>
           <w:i/>
           <w:iCs/>
           <w:sz w:val="18"/>
           <w:szCs w:val="18"/>
         </w:rPr>
-        <w:t xml:space="preserve">Nota. Diagrama en sintaxis Mermaid; renderizable en GitHub y en el README del repositorio.</w:t>
+        <w:t>Nota. Diagrama de arquitectura; fuente reproducible: scripts/render_diagramas.py.</w:t>
       </w:r>
     </w:p>
     <w:p>
@@ -729,32 +1301,36 @@
       </w:pPr>
       <w:r>
         <w:rPr>
-          <w:rFonts w:ascii="Times New Roman" w:cs="Times New Roman" w:eastAsia="Times New Roman" w:hAnsi="Times New Roman"/>
-          <w:sz w:val="22"/>
-          <w:szCs w:val="22"/>
-        </w:rPr>
-        <w:t xml:space="preserve">Los componentes clave y su integraciÃ³n son: (a) cliente LLM intercambiable (agent/llm_client.py) que abstrae Groq gpt-oss-120b y permite sustituir el proveedor con una lÃ­nea; (b) Recuperador (ChromaDB + embeddings locales); (c) tres herramientas de verificaciÃ³n con contratos tipados (estado del sendero, clima con umbrales explÃ­citos de lluvia â‰¥10 mm, viento â‰¥50 km/h y mÃ­nima â‰¤-2 Â°C, y disponibilidad de guÃ­a); (d) Replanificador (tools/replanner.py) con criterio determinista de elecciÃ³n; (e) capa de prompts con el par SISTEMA_BASE/SISTEMA_REPLAN; y (f) el Trazador JSONL transversal. Para la demostraciÃ³n se implementÃ³ una CLI (main.py con banderas --fecha, --pasos y --falso) y un notebook con cinco casos, incluyendo una replanificaciÃ³n y una replanificaciÃ³n fallida.</w:t>
-      </w:r>
-    </w:p>
-    <w:p>
-      <w:r>
-        <w:br w:type="page"/>
+          <w:rFonts w:ascii="Times New Roman" w:hAnsi="Times New Roman" w:eastAsia="Times New Roman" w:cs="Times New Roman"/>
+          <w:sz w:val="22"/>
+          <w:szCs w:val="22"/>
+        </w:rPr>
+        <w:t>Los componentes clave y su integración son: (a) cliente LLM intercambiable (agent/llm_client.py) que abstrae Groq gpt-oss-120b y permite sustituir el proveedor con una línea; (b) Recuperador (ChromaDB + embeddings locales); (c) tres herramientas de verificación con contratos tipados (estado del sendero, clima con umbrales explícitos de lluvia ≥10 mm, viento ≥50 km/h y mínima ≤-2 °C, y disponibilidad de guía); (d) Replanificador (tools/replanner.py) con criterio determinista de elección; (e) capa de prompts con el par SISTEMA_BASE/SISTEMA_REPLAN; y (f) el Trazador JSONL transversal. Para la demostración se implementó una CLI (main.py con banderas --fecha, --pasos y --falso) y un notebook con cinco casos, incluyendo una replanificación y una replanificación fallida. La demostración se complementa con una interfaz Streamlit (app.py) que expone los dos casos del guión en modo determinista. Como observabilidad opcional se integró ClienteLangChain (ChatGroq vía langchain-groq, mismo contrato completar()) y activación de LangSmith solo si existe LANGSMITH_API_KEY en el entorno; sin clave el trazado es no-op y los tests no cambian.</w:t>
+      </w:r>
+    </w:p>
+    <w:p>
+      <w:pPr>
+        <w:pageBreakBefore/>
+      </w:pPr>
+      <w:r>
+        <w:lastRenderedPageBreak/>
       </w:r>
     </w:p>
     <w:p>
       <w:pPr>
         <w:pStyle w:val="Heading1"/>
-        <w:spacing w:after="60" w:before="120"/>
-      </w:pPr>
-      <w:r>
-        <w:rPr>
-          <w:rFonts w:ascii="Times New Roman" w:cs="Times New Roman" w:eastAsia="Times New Roman" w:hAnsi="Times New Roman"/>
+        <w:spacing w:before="120" w:after="60"/>
+      </w:pPr>
+      <w:r>
+        <w:rPr>
+          <w:rFonts w:ascii="Times New Roman" w:hAnsi="Times New Roman" w:eastAsia="Times New Roman" w:cs="Times New Roman"/>
           <w:b/>
           <w:bCs/>
+          <w:color w:val="2E74B5"/>
           <w:sz w:val="26"/>
           <w:szCs w:val="26"/>
         </w:rPr>
-        <w:t xml:space="preserve">DocumentaciÃ³n TÃ©cnica: Decisiones y ValidaciÃ³n</w:t>
+        <w:t>Documentación Técnica: Decisiones y Validación</w:t>
       </w:r>
     </w:p>
     <w:p>
@@ -763,27 +1339,27 @@
       </w:pPr>
       <w:r>
         <w:rPr>
-          <w:rFonts w:ascii="Times New Roman" w:cs="Times New Roman" w:eastAsia="Times New Roman" w:hAnsi="Times New Roman"/>
-          <w:sz w:val="22"/>
-          <w:szCs w:val="22"/>
-        </w:rPr>
-        <w:t xml:space="preserve">El proyecto se desarrollÃ³ por fases en un repositorio (ep1-ecoturismo-agente, uv + Python 3.13) con tests unitarios por fase (10/10) y un conjunto de evaluaciÃ³n de 12 casos (tests/eval_dataset.json) que cubre: consultas sin conflicto, replanificaciÃ³n por sendero cerrado, por clima adverso, por guÃ­a no disponible y por temporada, casos sin alternativa viable (donde se espera respuesta honesta) y verificaciÃ³n de citas. Las expectativas se escribieron tras sondear el comportamiento real del agente, no de forma teÃ³rica. El resultado fue 12/12 casos correctos (100%), sobre la meta de 85%, ejecutado con un cliente falso determinista para reproducibilidad sin cuota.</w:t>
-      </w:r>
-    </w:p>
-    <w:p>
-      <w:pPr>
-        <w:spacing w:after="40" w:before="120" w:line="264"/>
+          <w:rFonts w:ascii="Times New Roman" w:hAnsi="Times New Roman" w:eastAsia="Times New Roman" w:cs="Times New Roman"/>
+          <w:sz w:val="22"/>
+          <w:szCs w:val="22"/>
+        </w:rPr>
+        <w:t>El proyecto se desarrolló por fases en un repositorio (ep1-ecoturismo-agente, uv + Python 3.13) con tests unitarios por fase (13/13) y un conjunto de evaluación de 12 casos (tests/eval_dataset.json) que cubre: consultas sin conflicto, replanificación por sendero cerrado, por clima adverso, por guía no disponible y por temporada, casos sin alternativa viable (donde se espera respuesta honesta) y verificación de citas. Las expectativas se escribieron tras sondear el comportamiento real del agente, no de forma teórica. El resultado fue 12/12 casos correctos (100%), sobre la meta de 85%, ejecutado con un cliente falso determinista para reproducibilidad sin cuota. En la corrección pre-entrega el recuperador pasó a leer EMBEDDING_MODEL desde el entorno (antes fijo en código) y ante una colección ausente entrega un error que indica re-ejecutar la ingesta.</w:t>
+      </w:r>
+    </w:p>
+    <w:p>
+      <w:pPr>
+        <w:spacing w:before="120" w:after="40" w:line="264"/>
         <w:jc w:val="center"/>
       </w:pPr>
       <w:r>
         <w:rPr>
-          <w:rFonts w:ascii="Times New Roman" w:cs="Times New Roman" w:eastAsia="Times New Roman" w:hAnsi="Times New Roman"/>
+          <w:rFonts w:ascii="Times New Roman" w:hAnsi="Times New Roman" w:eastAsia="Times New Roman" w:cs="Times New Roman"/>
           <w:b/>
           <w:bCs/>
           <w:sz w:val="22"/>
           <w:szCs w:val="22"/>
         </w:rPr>
-        <w:t xml:space="preserve">Tabla 2</w:t>
+        <w:t>Tabla 2</w:t>
       </w:r>
     </w:p>
     <w:p>
@@ -793,25 +1369,25 @@
       </w:pPr>
       <w:r>
         <w:rPr>
-          <w:rFonts w:ascii="Times New Roman" w:cs="Times New Roman" w:eastAsia="Times New Roman" w:hAnsi="Times New Roman"/>
+          <w:rFonts w:ascii="Times New Roman" w:hAnsi="Times New Roman" w:eastAsia="Times New Roman" w:cs="Times New Roman"/>
           <w:i/>
           <w:iCs/>
           <w:sz w:val="22"/>
           <w:szCs w:val="22"/>
         </w:rPr>
-        <w:t xml:space="preserve">Decisiones de diseÃ±o y su justificaciÃ³n</w:t>
+        <w:t>Decisiones de diseño y su justificación</w:t>
       </w:r>
     </w:p>
     <w:tbl>
       <w:tblPr>
-        <w:tblW w:type="dxa" w:w="9026"/>
+        <w:tblW w:w="9026" w:type="dxa"/>
         <w:tblBorders>
-          <w:top w:val="single" w:color="auto" w:sz="4"/>
-          <w:left w:val="single" w:color="auto" w:sz="4"/>
-          <w:bottom w:val="single" w:color="auto" w:sz="4"/>
-          <w:right w:val="single" w:color="auto" w:sz="4"/>
-          <w:insideH w:val="single" w:color="auto" w:sz="4"/>
-          <w:insideV w:val="single" w:color="auto" w:sz="4"/>
+          <w:top w:val="single" w:sz="4" w:color="auto"/>
+          <w:left w:val="single" w:sz="4" w:color="auto"/>
+          <w:bottom w:val="single" w:sz="4" w:color="auto"/>
+          <w:right w:val="single" w:sz="4" w:color="auto"/>
+          <w:insideH w:val="single" w:sz="4" w:color="auto"/>
+          <w:insideV w:val="single" w:sz="4" w:color="auto"/>
         </w:tblBorders>
       </w:tblPr>
       <w:tblGrid>
@@ -821,13 +1397,19 @@
       <w:tr>
         <w:tc>
           <w:tcPr>
-            <w:tcW w:type="dxa" w:w="3050"/>
-            <w:shd w:fill="F2F2F2" w:val="clear"/>
+            <w:tcW w:w="3050" w:type="dxa"/>
+            <w:tcBorders>
+              <w:top w:val="single" w:sz="4" w:color="auto"/>
+              <w:left w:val="single" w:sz="4" w:color="auto"/>
+              <w:bottom w:val="single" w:sz="4" w:color="auto"/>
+              <w:right w:val="single" w:sz="4" w:color="auto"/>
+            </w:tcBorders>
+            <w:shd w:val="clear" w:fill="F2F2F2"/>
             <w:tcMar>
-              <w:top w:type="dxa" w:w="40"/>
-              <w:left w:type="dxa" w:w="80"/>
-              <w:bottom w:type="dxa" w:w="40"/>
-              <w:right w:type="dxa" w:w="80"/>
+              <w:top w:w="40" w:type="dxa"/>
+              <w:left w:w="80" w:type="dxa"/>
+              <w:bottom w:w="40" w:type="dxa"/>
+              <w:right w:w="80" w:type="dxa"/>
             </w:tcMar>
           </w:tcPr>
           <w:p>
@@ -837,25 +1419,31 @@
             </w:pPr>
             <w:r>
               <w:rPr>
-                <w:rFonts w:ascii="Times New Roman" w:cs="Times New Roman" w:eastAsia="Times New Roman" w:hAnsi="Times New Roman"/>
+                <w:rFonts w:ascii="Times New Roman" w:hAnsi="Times New Roman" w:eastAsia="Times New Roman" w:cs="Times New Roman"/>
                 <w:b/>
                 <w:bCs/>
                 <w:sz w:val="20"/>
                 <w:szCs w:val="20"/>
               </w:rPr>
-              <w:t xml:space="preserve">DecisiÃ³n (alternativa descartada)</w:t>
-            </w:r>
-          </w:p>
-        </w:tc>
-        <w:tc>
-          <w:tcPr>
-            <w:tcW w:type="dxa" w:w="5976"/>
-            <w:shd w:fill="F2F2F2" w:val="clear"/>
+              <w:t>Decisión (alternativa descartada)</w:t>
+            </w:r>
+          </w:p>
+        </w:tc>
+        <w:tc>
+          <w:tcPr>
+            <w:tcW w:w="5976" w:type="dxa"/>
+            <w:tcBorders>
+              <w:top w:val="single" w:sz="4" w:color="auto"/>
+              <w:left w:val="single" w:sz="4" w:color="auto"/>
+              <w:bottom w:val="single" w:sz="4" w:color="auto"/>
+              <w:right w:val="single" w:sz="4" w:color="auto"/>
+            </w:tcBorders>
+            <w:shd w:val="clear" w:fill="F2F2F2"/>
             <w:tcMar>
-              <w:top w:type="dxa" w:w="40"/>
-              <w:left w:type="dxa" w:w="80"/>
-              <w:bottom w:type="dxa" w:w="40"/>
-              <w:right w:type="dxa" w:w="80"/>
+              <w:top w:w="40" w:type="dxa"/>
+              <w:left w:w="80" w:type="dxa"/>
+              <w:bottom w:w="40" w:type="dxa"/>
+              <w:right w:w="80" w:type="dxa"/>
             </w:tcMar>
           </w:tcPr>
           <w:p>
@@ -865,13 +1453,13 @@
             </w:pPr>
             <w:r>
               <w:rPr>
-                <w:rFonts w:ascii="Times New Roman" w:cs="Times New Roman" w:eastAsia="Times New Roman" w:hAnsi="Times New Roman"/>
+                <w:rFonts w:ascii="Times New Roman" w:hAnsi="Times New Roman" w:eastAsia="Times New Roman" w:cs="Times New Roman"/>
                 <w:b/>
                 <w:bCs/>
                 <w:sz w:val="20"/>
                 <w:szCs w:val="20"/>
               </w:rPr>
-              <w:t xml:space="preserve">JustificaciÃ³n</w:t>
+              <w:t>Justificación</w:t>
             </w:r>
           </w:p>
         </w:tc>
@@ -879,12 +1467,18 @@
       <w:tr>
         <w:tc>
           <w:tcPr>
-            <w:tcW w:type="dxa" w:w="3050"/>
+            <w:tcW w:w="3050" w:type="dxa"/>
+            <w:tcBorders>
+              <w:top w:val="single" w:sz="4" w:color="auto"/>
+              <w:left w:val="single" w:sz="4" w:color="auto"/>
+              <w:bottom w:val="single" w:sz="4" w:color="auto"/>
+              <w:right w:val="single" w:sz="4" w:color="auto"/>
+            </w:tcBorders>
             <w:tcMar>
-              <w:top w:type="dxa" w:w="40"/>
-              <w:left w:type="dxa" w:w="80"/>
-              <w:bottom w:type="dxa" w:w="40"/>
-              <w:right w:type="dxa" w:w="80"/>
+              <w:top w:w="40" w:type="dxa"/>
+              <w:left w:w="80" w:type="dxa"/>
+              <w:bottom w:w="40" w:type="dxa"/>
+              <w:right w:w="80" w:type="dxa"/>
             </w:tcMar>
           </w:tcPr>
           <w:p>
@@ -894,24 +1488,28 @@
             </w:pPr>
             <w:r>
               <w:rPr>
-                <w:rFonts w:ascii="Times New Roman" w:cs="Times New Roman" w:eastAsia="Times New Roman" w:hAnsi="Times New Roman"/>
-                <w:b w:val="false"/>
-                <w:bCs w:val="false"/>
+                <w:rFonts w:ascii="Times New Roman" w:hAnsi="Times New Roman" w:eastAsia="Times New Roman" w:cs="Times New Roman"/>
                 <w:sz w:val="20"/>
                 <w:szCs w:val="20"/>
               </w:rPr>
-              <w:t xml:space="preserve">Loop propio sin LangGraph (D8)</w:t>
-            </w:r>
-          </w:p>
-        </w:tc>
-        <w:tc>
-          <w:tcPr>
-            <w:tcW w:type="dxa" w:w="5976"/>
+              <w:t>Loop propio sin LangGraph (D8)</w:t>
+            </w:r>
+          </w:p>
+        </w:tc>
+        <w:tc>
+          <w:tcPr>
+            <w:tcW w:w="5976" w:type="dxa"/>
+            <w:tcBorders>
+              <w:top w:val="single" w:sz="4" w:color="auto"/>
+              <w:left w:val="single" w:sz="4" w:color="auto"/>
+              <w:bottom w:val="single" w:sz="4" w:color="auto"/>
+              <w:right w:val="single" w:sz="4" w:color="auto"/>
+            </w:tcBorders>
             <w:tcMar>
-              <w:top w:type="dxa" w:w="40"/>
-              <w:left w:type="dxa" w:w="80"/>
-              <w:bottom w:type="dxa" w:w="40"/>
-              <w:right w:type="dxa" w:w="80"/>
+              <w:top w:w="40" w:type="dxa"/>
+              <w:left w:w="80" w:type="dxa"/>
+              <w:bottom w:w="40" w:type="dxa"/>
+              <w:right w:w="80" w:type="dxa"/>
             </w:tcMar>
           </w:tcPr>
           <w:p>
@@ -921,13 +1519,11 @@
             </w:pPr>
             <w:r>
               <w:rPr>
-                <w:rFonts w:ascii="Times New Roman" w:cs="Times New Roman" w:eastAsia="Times New Roman" w:hAnsi="Times New Roman"/>
-                <w:b w:val="false"/>
-                <w:bCs w:val="false"/>
+                <w:rFonts w:ascii="Times New Roman" w:hAnsi="Times New Roman" w:eastAsia="Times New Roman" w:cs="Times New Roman"/>
                 <w:sz w:val="20"/>
                 <w:szCs w:val="20"/>
               </w:rPr>
-              <w:t xml:space="preserve">Control total de la trazabilidad por paso (requisito del encargo); LangGraph agrega una capa innecesaria para un solo agente</w:t>
+              <w:t>Control total de la trazabilidad por paso (requisito del encargo); LangGraph agrega una capa innecesaria para un solo agente</w:t>
             </w:r>
           </w:p>
         </w:tc>
@@ -935,12 +1531,18 @@
       <w:tr>
         <w:tc>
           <w:tcPr>
-            <w:tcW w:type="dxa" w:w="3050"/>
+            <w:tcW w:w="3050" w:type="dxa"/>
+            <w:tcBorders>
+              <w:top w:val="single" w:sz="4" w:color="auto"/>
+              <w:left w:val="single" w:sz="4" w:color="auto"/>
+              <w:bottom w:val="single" w:sz="4" w:color="auto"/>
+              <w:right w:val="single" w:sz="4" w:color="auto"/>
+            </w:tcBorders>
             <w:tcMar>
-              <w:top w:type="dxa" w:w="40"/>
-              <w:left w:type="dxa" w:w="80"/>
-              <w:bottom w:type="dxa" w:w="40"/>
-              <w:right w:type="dxa" w:w="80"/>
+              <w:top w:w="40" w:type="dxa"/>
+              <w:left w:w="80" w:type="dxa"/>
+              <w:bottom w:w="40" w:type="dxa"/>
+              <w:right w:w="80" w:type="dxa"/>
             </w:tcMar>
           </w:tcPr>
           <w:p>
@@ -950,24 +1552,28 @@
             </w:pPr>
             <w:r>
               <w:rPr>
-                <w:rFonts w:ascii="Times New Roman" w:cs="Times New Roman" w:eastAsia="Times New Roman" w:hAnsi="Times New Roman"/>
-                <w:b w:val="false"/>
-                <w:bCs w:val="false"/>
+                <w:rFonts w:ascii="Times New Roman" w:hAnsi="Times New Roman" w:eastAsia="Times New Roman" w:cs="Times New Roman"/>
                 <w:sz w:val="20"/>
                 <w:szCs w:val="20"/>
               </w:rPr>
-              <w:t xml:space="preserve">ChromaDB sobre FAISS (D3)</w:t>
-            </w:r>
-          </w:p>
-        </w:tc>
-        <w:tc>
-          <w:tcPr>
-            <w:tcW w:type="dxa" w:w="5976"/>
+              <w:t>ChromaDB sobre FAISS (D3)</w:t>
+            </w:r>
+          </w:p>
+        </w:tc>
+        <w:tc>
+          <w:tcPr>
+            <w:tcW w:w="5976" w:type="dxa"/>
+            <w:tcBorders>
+              <w:top w:val="single" w:sz="4" w:color="auto"/>
+              <w:left w:val="single" w:sz="4" w:color="auto"/>
+              <w:bottom w:val="single" w:sz="4" w:color="auto"/>
+              <w:right w:val="single" w:sz="4" w:color="auto"/>
+            </w:tcBorders>
             <w:tcMar>
-              <w:top w:type="dxa" w:w="40"/>
-              <w:left w:type="dxa" w:w="80"/>
-              <w:bottom w:type="dxa" w:w="40"/>
-              <w:right w:type="dxa" w:w="80"/>
+              <w:top w:w="40" w:type="dxa"/>
+              <w:left w:w="80" w:type="dxa"/>
+              <w:bottom w:w="40" w:type="dxa"/>
+              <w:right w:w="80" w:type="dxa"/>
             </w:tcMar>
           </w:tcPr>
           <w:p>
@@ -977,13 +1583,11 @@
             </w:pPr>
             <w:r>
               <w:rPr>
-                <w:rFonts w:ascii="Times New Roman" w:cs="Times New Roman" w:eastAsia="Times New Roman" w:hAnsi="Times New Roman"/>
-                <w:b w:val="false"/>
-                <w:bCs w:val="false"/>
+                <w:rFonts w:ascii="Times New Roman" w:hAnsi="Times New Roman" w:eastAsia="Times New Roman" w:cs="Times New Roman"/>
                 <w:sz w:val="20"/>
                 <w:szCs w:val="20"/>
               </w:rPr>
-              <w:t xml:space="preserve">Filtro nativo por metadata; en FAISS el filtrado debe simularse, con riesgo de k insuficiente</w:t>
+              <w:t>Filtro nativo por metadata; en FAISS el filtrado debe simularse, con riesgo de k insuficiente</w:t>
             </w:r>
           </w:p>
         </w:tc>
@@ -991,12 +1595,18 @@
       <w:tr>
         <w:tc>
           <w:tcPr>
-            <w:tcW w:type="dxa" w:w="3050"/>
+            <w:tcW w:w="3050" w:type="dxa"/>
+            <w:tcBorders>
+              <w:top w:val="single" w:sz="4" w:color="auto"/>
+              <w:left w:val="single" w:sz="4" w:color="auto"/>
+              <w:bottom w:val="single" w:sz="4" w:color="auto"/>
+              <w:right w:val="single" w:sz="4" w:color="auto"/>
+            </w:tcBorders>
             <w:tcMar>
-              <w:top w:type="dxa" w:w="40"/>
-              <w:left w:type="dxa" w:w="80"/>
-              <w:bottom w:type="dxa" w:w="40"/>
-              <w:right w:type="dxa" w:w="80"/>
+              <w:top w:w="40" w:type="dxa"/>
+              <w:left w:w="80" w:type="dxa"/>
+              <w:bottom w:w="40" w:type="dxa"/>
+              <w:right w:w="80" w:type="dxa"/>
             </w:tcMar>
           </w:tcPr>
           <w:p>
@@ -1006,24 +1616,28 @@
             </w:pPr>
             <w:r>
               <w:rPr>
-                <w:rFonts w:ascii="Times New Roman" w:cs="Times New Roman" w:eastAsia="Times New Roman" w:hAnsi="Times New Roman"/>
-                <w:b w:val="false"/>
-                <w:bCs w:val="false"/>
+                <w:rFonts w:ascii="Times New Roman" w:hAnsi="Times New Roman" w:eastAsia="Times New Roman" w:cs="Times New Roman"/>
                 <w:sz w:val="20"/>
                 <w:szCs w:val="20"/>
               </w:rPr>
-              <w:t xml:space="preserve">ReplanificaciÃ³n determinista en cÃ³digo</w:t>
-            </w:r>
-          </w:p>
-        </w:tc>
-        <w:tc>
-          <w:tcPr>
-            <w:tcW w:type="dxa" w:w="5976"/>
+              <w:t>Replanificación determinista en código</w:t>
+            </w:r>
+          </w:p>
+        </w:tc>
+        <w:tc>
+          <w:tcPr>
+            <w:tcW w:w="5976" w:type="dxa"/>
+            <w:tcBorders>
+              <w:top w:val="single" w:sz="4" w:color="auto"/>
+              <w:left w:val="single" w:sz="4" w:color="auto"/>
+              <w:bottom w:val="single" w:sz="4" w:color="auto"/>
+              <w:right w:val="single" w:sz="4" w:color="auto"/>
+            </w:tcBorders>
             <w:tcMar>
-              <w:top w:type="dxa" w:w="40"/>
-              <w:left w:type="dxa" w:w="80"/>
-              <w:bottom w:type="dxa" w:w="40"/>
-              <w:right w:type="dxa" w:w="80"/>
+              <w:top w:w="40" w:type="dxa"/>
+              <w:left w:w="80" w:type="dxa"/>
+              <w:bottom w:w="40" w:type="dxa"/>
+              <w:right w:w="80" w:type="dxa"/>
             </w:tcMar>
           </w:tcPr>
           <w:p>
@@ -1033,13 +1647,11 @@
             </w:pPr>
             <w:r>
               <w:rPr>
-                <w:rFonts w:ascii="Times New Roman" w:cs="Times New Roman" w:eastAsia="Times New Roman" w:hAnsi="Times New Roman"/>
-                <w:b w:val="false"/>
-                <w:bCs w:val="false"/>
+                <w:rFonts w:ascii="Times New Roman" w:hAnsi="Times New Roman" w:eastAsia="Times New Roman" w:cs="Times New Roman"/>
                 <w:sz w:val="20"/>
                 <w:szCs w:val="20"/>
               </w:rPr>
-              <w:t xml:space="preserve">El criterio viable/no viable se evalÃºa con reglas explÃ­citas; el LLM solo redacta, no decide</w:t>
+              <w:t>El criterio viable/no viable se evalúa con reglas explícitas; el LLM solo redacta, no decide</w:t>
             </w:r>
           </w:p>
         </w:tc>
@@ -1047,12 +1659,18 @@
       <w:tr>
         <w:tc>
           <w:tcPr>
-            <w:tcW w:type="dxa" w:w="3050"/>
+            <w:tcW w:w="3050" w:type="dxa"/>
+            <w:tcBorders>
+              <w:top w:val="single" w:sz="4" w:color="auto"/>
+              <w:left w:val="single" w:sz="4" w:color="auto"/>
+              <w:bottom w:val="single" w:sz="4" w:color="auto"/>
+              <w:right w:val="single" w:sz="4" w:color="auto"/>
+            </w:tcBorders>
             <w:tcMar>
-              <w:top w:type="dxa" w:w="40"/>
-              <w:left w:type="dxa" w:w="80"/>
-              <w:bottom w:type="dxa" w:w="40"/>
-              <w:right w:type="dxa" w:w="80"/>
+              <w:top w:w="40" w:type="dxa"/>
+              <w:left w:w="80" w:type="dxa"/>
+              <w:bottom w:w="40" w:type="dxa"/>
+              <w:right w:w="80" w:type="dxa"/>
             </w:tcMar>
           </w:tcPr>
           <w:p>
@@ -1062,24 +1680,28 @@
             </w:pPr>
             <w:r>
               <w:rPr>
-                <w:rFonts w:ascii="Times New Roman" w:cs="Times New Roman" w:eastAsia="Times New Roman" w:hAnsi="Times New Roman"/>
-                <w:b w:val="false"/>
-                <w:bCs w:val="false"/>
+                <w:rFonts w:ascii="Times New Roman" w:hAnsi="Times New Roman" w:eastAsia="Times New Roman" w:cs="Times New Roman"/>
                 <w:sz w:val="20"/>
                 <w:szCs w:val="20"/>
               </w:rPr>
-              <w:t xml:space="preserve">Cliente falso determinista</w:t>
-            </w:r>
-          </w:p>
-        </w:tc>
-        <w:tc>
-          <w:tcPr>
-            <w:tcW w:type="dxa" w:w="5976"/>
+              <w:t>Cliente falso determinista</w:t>
+            </w:r>
+          </w:p>
+        </w:tc>
+        <w:tc>
+          <w:tcPr>
+            <w:tcW w:w="5976" w:type="dxa"/>
+            <w:tcBorders>
+              <w:top w:val="single" w:sz="4" w:color="auto"/>
+              <w:left w:val="single" w:sz="4" w:color="auto"/>
+              <w:bottom w:val="single" w:sz="4" w:color="auto"/>
+              <w:right w:val="single" w:sz="4" w:color="auto"/>
+            </w:tcBorders>
             <w:tcMar>
-              <w:top w:type="dxa" w:w="40"/>
-              <w:left w:type="dxa" w:w="80"/>
-              <w:bottom w:type="dxa" w:w="40"/>
-              <w:right w:type="dxa" w:w="80"/>
+              <w:top w:w="40" w:type="dxa"/>
+              <w:left w:w="80" w:type="dxa"/>
+              <w:bottom w:w="40" w:type="dxa"/>
+              <w:right w:w="80" w:type="dxa"/>
             </w:tcMar>
           </w:tcPr>
           <w:p>
@@ -1089,13 +1711,11 @@
             </w:pPr>
             <w:r>
               <w:rPr>
-                <w:rFonts w:ascii="Times New Roman" w:cs="Times New Roman" w:eastAsia="Times New Roman" w:hAnsi="Times New Roman"/>
-                <w:b w:val="false"/>
-                <w:bCs w:val="false"/>
+                <w:rFonts w:ascii="Times New Roman" w:hAnsi="Times New Roman" w:eastAsia="Times New Roman" w:cs="Times New Roman"/>
                 <w:sz w:val="20"/>
                 <w:szCs w:val="20"/>
               </w:rPr>
-              <w:t xml:space="preserve">Tests y evals reproducibles sin cuota; el LLM real se valida aparte con la API de Groq</w:t>
+              <w:t>Tests y evals reproducibles sin cuota; el LLM real se valida aparte con la API de Groq</w:t>
             </w:r>
           </w:p>
         </w:tc>
@@ -1103,31 +1723,535 @@
     </w:tbl>
     <w:p>
       <w:pPr>
-        <w:spacing w:after="80" w:before="160" w:line="264"/>
-      </w:pPr>
-      <w:r>
-        <w:rPr>
-          <w:rFonts w:ascii="Times New Roman" w:cs="Times New Roman" w:eastAsia="Times New Roman" w:hAnsi="Times New Roman"/>
-          <w:sz w:val="22"/>
-          <w:szCs w:val="22"/>
-        </w:rPr>
-        <w:t xml:space="preserve">Como evidencia de robustez de la arquitectura base, se construyÃ³ un segundo prototipo con el mismo esqueleto (ep1-veterinaria-agente: RAG de fichas clÃ­nicas, calculadora de dosis mg/kg y verificador de interacciones con guardrails post-LLM) que obtuvo 14/14 casos (100%) en sus evals; la superficie reutilizada fue de aproximadamente 100 lÃ­neas (cliente LLM, trazador y recuperador), validando la decisiÃ³n de separar la arquitectura del dominio.</w:t>
-      </w:r>
-    </w:p>
-    <w:p>
-      <w:pPr>
-        <w:pStyle w:val="Heading1"/>
-        <w:spacing w:after="60" w:before="120"/>
-      </w:pPr>
-      <w:r>
-        <w:rPr>
-          <w:rFonts w:ascii="Times New Roman" w:cs="Times New Roman" w:eastAsia="Times New Roman" w:hAnsi="Times New Roman"/>
+        <w:spacing w:before="160" w:after="80" w:line="264"/>
+      </w:pPr>
+      <w:r>
+        <w:rPr>
+          <w:rFonts w:ascii="Times New Roman" w:hAnsi="Times New Roman" w:eastAsia="Times New Roman" w:cs="Times New Roman"/>
+          <w:sz w:val="22"/>
+          <w:szCs w:val="22"/>
+        </w:rPr>
+        <w:t>Como evidencia de robustez de la arquitectura base, se construyó un segundo prototipo con el mismo esqueleto (ep1-veterinaria-agente: RAG de fichas clínicas, calculadora de dosis mg/kg y verificador de interacciones con guardrails post-LLM) que obtuvo 14/14 casos (100%) en sus evals; la superficie reutilizada fue de aproximadamente 100 líneas (cliente LLM, trazador y recuperador), validando la decisión de separar la arquitectura del dominio.</w:t>
+      </w:r>
+    </w:p>
+    <w:p>
+      <w:pPr>
+        <w:spacing w:before="0" w:after="0"/>
+      </w:pPr>
+      <w:r>
+        <w:rPr>
+          <w:rFonts w:ascii="Times New Roman" w:hAnsi="Times New Roman" w:eastAsia="Times New Roman" w:cs="Times New Roman"/>
           <w:b/>
           <w:bCs/>
+          <w:sz w:val="22"/>
+          <w:szCs w:val="22"/>
+        </w:rPr>
+        <w:t>Tabla 4</w:t>
+      </w:r>
+    </w:p>
+    <w:p>
+      <w:pPr>
+        <w:spacing w:before="0" w:after="160"/>
+      </w:pPr>
+      <w:r>
+        <w:rPr>
+          <w:rFonts w:ascii="Times New Roman" w:hAnsi="Times New Roman" w:eastAsia="Times New Roman" w:cs="Times New Roman"/>
+          <w:i/>
+          <w:iCs/>
+          <w:sz w:val="22"/>
+          <w:szCs w:val="22"/>
+        </w:rPr>
+        <w:t>Métricas RAG sobre los 12 casos (ClienteFalso determinista, tests/metricas_rag.py)</w:t>
+      </w:r>
+    </w:p>
+    <w:tbl>
+      <w:tblPr>
+        <w:tblW w:w="0" w:type="auto"/>
+        <w:tblLook w:firstRow="1" w:firstColumn="1" w:noVBand="1"/>
+      </w:tblPr>
+      <w:tblGrid>
+        <w:gridCol w:w="3009"/>
+        <w:gridCol w:w="3009"/>
+        <w:gridCol w:w="3009"/>
+      </w:tblGrid>
+      <w:tr>
+        <w:tc>
+          <w:tcPr>
+            <w:tcW w:w="3009" w:type="dxa"/>
+          </w:tcPr>
+          <w:p>
+            <w:r/>
+            <w:r>
+              <w:rPr>
+                <w:rFonts w:ascii="Times New Roman" w:hAnsi="Times New Roman" w:eastAsia="Times New Roman" w:cs="Times New Roman"/>
+                <w:b/>
+                <w:bCs/>
+                <w:sz w:val="22"/>
+                <w:szCs w:val="22"/>
+              </w:rPr>
+              <w:t>Métrica</w:t>
+            </w:r>
+          </w:p>
+        </w:tc>
+        <w:tc>
+          <w:tcPr>
+            <w:tcW w:w="3009" w:type="dxa"/>
+          </w:tcPr>
+          <w:p>
+            <w:r/>
+            <w:r>
+              <w:rPr>
+                <w:rFonts w:ascii="Times New Roman" w:hAnsi="Times New Roman" w:eastAsia="Times New Roman" w:cs="Times New Roman"/>
+                <w:b/>
+                <w:bCs/>
+                <w:sz w:val="22"/>
+                <w:szCs w:val="22"/>
+              </w:rPr>
+              <w:t>Valor (n=12)</w:t>
+            </w:r>
+          </w:p>
+        </w:tc>
+        <w:tc>
+          <w:tcPr>
+            <w:tcW w:w="3009" w:type="dxa"/>
+          </w:tcPr>
+          <w:p>
+            <w:r/>
+            <w:r>
+              <w:rPr>
+                <w:rFonts w:ascii="Times New Roman" w:hAnsi="Times New Roman" w:eastAsia="Times New Roman" w:cs="Times New Roman"/>
+                <w:b/>
+                <w:bCs/>
+                <w:sz w:val="22"/>
+                <w:szCs w:val="22"/>
+              </w:rPr>
+              <w:t>Lectura</w:t>
+            </w:r>
+          </w:p>
+        </w:tc>
+      </w:tr>
+      <w:tr>
+        <w:tc>
+          <w:tcPr>
+            <w:tcW w:w="3009" w:type="dxa"/>
+          </w:tcPr>
+          <w:p>
+            <w:r/>
+            <w:r>
+              <w:rPr>
+                <w:rFonts w:ascii="Times New Roman" w:hAnsi="Times New Roman" w:eastAsia="Times New Roman" w:cs="Times New Roman"/>
+                <w:sz w:val="22"/>
+                <w:szCs w:val="22"/>
+              </w:rPr>
+              <w:t>Context Precision</w:t>
+            </w:r>
+          </w:p>
+        </w:tc>
+        <w:tc>
+          <w:tcPr>
+            <w:tcW w:w="3009" w:type="dxa"/>
+          </w:tcPr>
+          <w:p>
+            <w:r/>
+            <w:r>
+              <w:rPr>
+                <w:rFonts w:ascii="Times New Roman" w:hAnsi="Times New Roman" w:eastAsia="Times New Roman" w:cs="Times New Roman"/>
+                <w:sz w:val="22"/>
+                <w:szCs w:val="22"/>
+              </w:rPr>
+              <w:t>0,28</w:t>
+            </w:r>
+          </w:p>
+        </w:tc>
+        <w:tc>
+          <w:tcPr>
+            <w:tcW w:w="3009" w:type="dxa"/>
+          </w:tcPr>
+          <w:p>
+            <w:r/>
+            <w:r>
+              <w:rPr>
+                <w:rFonts w:ascii="Times New Roman" w:hAnsi="Times New Roman" w:eastAsia="Times New Roman" w:cs="Times New Roman"/>
+                <w:sz w:val="22"/>
+                <w:szCs w:val="22"/>
+              </w:rPr>
+              <w:t>Moderada: k=5 sobre 9 paquetes trae vecinos semánticos; el pertinente siempre está.</w:t>
+            </w:r>
+          </w:p>
+        </w:tc>
+      </w:tr>
+      <w:tr>
+        <w:tc>
+          <w:tcPr>
+            <w:tcW w:w="3009" w:type="dxa"/>
+          </w:tcPr>
+          <w:p>
+            <w:r/>
+            <w:r>
+              <w:rPr>
+                <w:rFonts w:ascii="Times New Roman" w:hAnsi="Times New Roman" w:eastAsia="Times New Roman" w:cs="Times New Roman"/>
+                <w:sz w:val="22"/>
+                <w:szCs w:val="22"/>
+              </w:rPr>
+              <w:t>Context Recall</w:t>
+            </w:r>
+          </w:p>
+        </w:tc>
+        <w:tc>
+          <w:tcPr>
+            <w:tcW w:w="3009" w:type="dxa"/>
+          </w:tcPr>
+          <w:p>
+            <w:r/>
+            <w:r>
+              <w:rPr>
+                <w:rFonts w:ascii="Times New Roman" w:hAnsi="Times New Roman" w:eastAsia="Times New Roman" w:cs="Times New Roman"/>
+                <w:sz w:val="22"/>
+                <w:szCs w:val="22"/>
+              </w:rPr>
+              <w:t>1,00</w:t>
+            </w:r>
+          </w:p>
+        </w:tc>
+        <w:tc>
+          <w:tcPr>
+            <w:tcW w:w="3009" w:type="dxa"/>
+          </w:tcPr>
+          <w:p>
+            <w:r/>
+            <w:r>
+              <w:rPr>
+                <w:rFonts w:ascii="Times New Roman" w:hAnsi="Times New Roman" w:eastAsia="Times New Roman" w:cs="Times New Roman"/>
+                <w:sz w:val="22"/>
+                <w:szCs w:val="22"/>
+              </w:rPr>
+              <w:t>Total: el paquete esperado (final u original) siempre fue recuperado.</w:t>
+            </w:r>
+          </w:p>
+        </w:tc>
+      </w:tr>
+      <w:tr>
+        <w:tc>
+          <w:tcPr>
+            <w:tcW w:w="3009" w:type="dxa"/>
+          </w:tcPr>
+          <w:p>
+            <w:r/>
+            <w:r>
+              <w:rPr>
+                <w:rFonts w:ascii="Times New Roman" w:hAnsi="Times New Roman" w:eastAsia="Times New Roman" w:cs="Times New Roman"/>
+                <w:sz w:val="22"/>
+                <w:szCs w:val="22"/>
+              </w:rPr>
+              <w:t>Faithfulness</w:t>
+            </w:r>
+          </w:p>
+        </w:tc>
+        <w:tc>
+          <w:tcPr>
+            <w:tcW w:w="3009" w:type="dxa"/>
+          </w:tcPr>
+          <w:p>
+            <w:r/>
+            <w:r>
+              <w:rPr>
+                <w:rFonts w:ascii="Times New Roman" w:hAnsi="Times New Roman" w:eastAsia="Times New Roman" w:cs="Times New Roman"/>
+                <w:sz w:val="22"/>
+                <w:szCs w:val="22"/>
+              </w:rPr>
+              <w:t>1,00</w:t>
+            </w:r>
+          </w:p>
+        </w:tc>
+        <w:tc>
+          <w:tcPr>
+            <w:tcW w:w="3009" w:type="dxa"/>
+          </w:tcPr>
+          <w:p>
+            <w:r/>
+            <w:r>
+              <w:rPr>
+                <w:rFonts w:ascii="Times New Roman" w:hAnsi="Times New Roman" w:eastAsia="Times New Roman" w:cs="Times New Roman"/>
+                <w:sz w:val="22"/>
+                <w:szCs w:val="22"/>
+              </w:rPr>
+              <w:t>Total: toda cita [F#] resolvió a un fragmento recuperado (guardarraíl _extraer_fuentes).</w:t>
+            </w:r>
+          </w:p>
+        </w:tc>
+      </w:tr>
+      <w:tr>
+        <w:tc>
+          <w:tcPr>
+            <w:tcW w:w="3009" w:type="dxa"/>
+          </w:tcPr>
+          <w:p>
+            <w:r/>
+            <w:r>
+              <w:rPr>
+                <w:rFonts w:ascii="Times New Roman" w:hAnsi="Times New Roman" w:eastAsia="Times New Roman" w:cs="Times New Roman"/>
+                <w:sz w:val="22"/>
+                <w:szCs w:val="22"/>
+              </w:rPr>
+              <w:t>Answer Relevancy</w:t>
+            </w:r>
+          </w:p>
+        </w:tc>
+        <w:tc>
+          <w:tcPr>
+            <w:tcW w:w="3009" w:type="dxa"/>
+          </w:tcPr>
+          <w:p>
+            <w:r/>
+            <w:r>
+              <w:rPr>
+                <w:rFonts w:ascii="Times New Roman" w:hAnsi="Times New Roman" w:eastAsia="Times New Roman" w:cs="Times New Roman"/>
+                <w:sz w:val="22"/>
+                <w:szCs w:val="22"/>
+              </w:rPr>
+              <w:t>1,00</w:t>
+            </w:r>
+          </w:p>
+        </w:tc>
+        <w:tc>
+          <w:tcPr>
+            <w:tcW w:w="3009" w:type="dxa"/>
+          </w:tcPr>
+          <w:p>
+            <w:r/>
+            <w:r>
+              <w:rPr>
+                <w:rFonts w:ascii="Times New Roman" w:hAnsi="Times New Roman" w:eastAsia="Times New Roman" w:cs="Times New Roman"/>
+                <w:sz w:val="22"/>
+                <w:szCs w:val="22"/>
+              </w:rPr>
+              <w:t>12/12 veredictos OK del harness (meta ≥85 %).</w:t>
+            </w:r>
+          </w:p>
+        </w:tc>
+      </w:tr>
+      <w:tr>
+        <w:tc>
+          <w:tcPr>
+            <w:tcW w:type="dxa" w:w="3009"/>
+          </w:tcPr>
+          <w:p>
+            <w:r>
+              <w:t>Precision@1</w:t>
+            </w:r>
+          </w:p>
+        </w:tc>
+        <w:tc>
+          <w:tcPr>
+            <w:tcW w:type="dxa" w:w="3009"/>
+          </w:tcPr>
+          <w:p>
+            <w:r>
+              <w:t>1,00</w:t>
+            </w:r>
+          </w:p>
+        </w:tc>
+        <w:tc>
+          <w:tcPr>
+            <w:tcW w:type="dxa" w:w="3009"/>
+          </w:tcPr>
+          <w:p>
+            <w:r>
+              <w:t>Total: el primer paquete recuperado siempre fue pertinente</w:t>
+            </w:r>
+          </w:p>
+        </w:tc>
+      </w:tr>
+      <w:tr>
+        <w:tc>
+          <w:tcPr>
+            <w:tcW w:type="dxa" w:w="3009"/>
+          </w:tcPr>
+          <w:p>
+            <w:r>
+              <w:t>MRR</w:t>
+            </w:r>
+          </w:p>
+        </w:tc>
+        <w:tc>
+          <w:tcPr>
+            <w:tcW w:type="dxa" w:w="3009"/>
+          </w:tcPr>
+          <w:p>
+            <w:r>
+              <w:t>1,00</w:t>
+            </w:r>
+          </w:p>
+        </w:tc>
+        <w:tc>
+          <w:tcPr>
+            <w:tcW w:type="dxa" w:w="3009"/>
+          </w:tcPr>
+          <w:p>
+            <w:r>
+              <w:t>Total: el pertinente siempre rankeó primero (k=5 trae ruido, pero abajo)</w:t>
+            </w:r>
+          </w:p>
+        </w:tc>
+      </w:tr>
+    </w:tbl>
+    <w:p>
+      <w:pPr>
+        <w:spacing w:before="0" w:after="0"/>
+      </w:pPr>
+      <w:r>
+        <w:rPr>
+          <w:rFonts w:ascii="Times New Roman" w:hAnsi="Times New Roman" w:eastAsia="Times New Roman" w:cs="Times New Roman"/>
+          <w:b/>
+          <w:bCs/>
+          <w:sz w:val="22"/>
+          <w:szCs w:val="22"/>
+        </w:rPr>
+        <w:t>Figura 2</w:t>
+      </w:r>
+    </w:p>
+    <w:p>
+      <w:pPr>
+        <w:spacing w:before="0" w:after="160"/>
+      </w:pPr>
+      <w:r>
+        <w:rPr>
+          <w:rFonts w:ascii="Times New Roman" w:hAnsi="Times New Roman" w:eastAsia="Times New Roman" w:cs="Times New Roman"/>
+          <w:i/>
+          <w:iCs/>
+          <w:sz w:val="22"/>
+          <w:szCs w:val="22"/>
+        </w:rPr>
+        <w:t>Salida real de python -m tests.metricas_rag (extracto)</w:t>
+      </w:r>
+    </w:p>
+    <w:p>
+      <w:pPr>
+        <w:spacing w:before="0" w:after="0"/>
+      </w:pPr>
+      <w:r>
+        <w:t>E01 rec=4 Prec=0,25 Rec=1,00 Faith=1,00 P@1=1,00 MRR=1,00 OK</w:t>
+      </w:r>
+    </w:p>
+    <w:p>
+      <w:pPr>
+        <w:spacing w:before="0" w:after="0"/>
+      </w:pPr>
+      <w:r>
+        <w:t>E02 rec=4 Prec=0,25 Rec=1,00 Faith=1,00 P@1=1,00 MRR=1,00 OK</w:t>
+      </w:r>
+    </w:p>
+    <w:p>
+      <w:pPr>
+        <w:spacing w:before="0" w:after="0"/>
+      </w:pPr>
+      <w:r>
+        <w:t>E03 rec=4 Prec=0,25 Rec=1,00 Faith=1,00 P@1=1,00 MRR=1,00 OK</w:t>
+      </w:r>
+    </w:p>
+    <w:p>
+      <w:pPr>
+        <w:spacing w:before="0" w:after="0"/>
+      </w:pPr>
+      <w:r>
+        <w:t>E04 rec=6 Prec=0,33 Rec=1,00 Faith=1,00 P@1=1,00 MRR=1,00 OK</w:t>
+      </w:r>
+    </w:p>
+    <w:p>
+      <w:pPr>
+        <w:spacing w:before="0" w:after="0"/>
+      </w:pPr>
+      <w:r>
+        <w:t>E05 rec=7 Prec=0,29 Rec=1,00 Faith=1,00 P@1=1,00 MRR=1,00 OK</w:t>
+      </w:r>
+    </w:p>
+    <w:p>
+      <w:pPr>
+        <w:spacing w:before="0" w:after="0"/>
+      </w:pPr>
+      <w:r>
+        <w:t>E06 rec=5 Prec=0,40 Rec=1,00 Faith=1,00 P@1=1,00 MRR=1,00 OK</w:t>
+      </w:r>
+    </w:p>
+    <w:p>
+      <w:pPr>
+        <w:spacing w:before="0" w:after="0"/>
+      </w:pPr>
+      <w:r>
+        <w:t>E07 rec=6 Prec=0,33 Rec=1,00 Faith=1,00 P@1=1,00 MRR=1,00 OK</w:t>
+      </w:r>
+    </w:p>
+    <w:p>
+      <w:pPr>
+        <w:spacing w:before="0" w:after="0"/>
+      </w:pPr>
+      <w:r>
+        <w:t>E08 rec=5 Prec=0,20 Rec=1,00 Faith=1,00 P@1=1,00 MRR=1,00 OK</w:t>
+      </w:r>
+    </w:p>
+    <w:p>
+      <w:pPr>
+        <w:spacing w:before="0" w:after="0"/>
+      </w:pPr>
+      <w:r>
+        <w:t>E09 rec=4 Prec=0,25 Rec=1,00 Faith=1,00 P@1=1,00 MRR=1,00 OK</w:t>
+      </w:r>
+    </w:p>
+    <w:p>
+      <w:pPr>
+        <w:spacing w:before="0" w:after="0"/>
+      </w:pPr>
+      <w:r>
+        <w:t>E10 rec=6 Prec=0,17 Rec=1,00 Faith=1,00 P@1=1,00 MRR=1,00 OK</w:t>
+      </w:r>
+    </w:p>
+    <w:p>
+      <w:pPr>
+        <w:spacing w:before="0" w:after="0"/>
+      </w:pPr>
+      <w:r>
+        <w:t>E11 rec=3 Prec=0,33 Rec=1,00 Faith=1,00 P@1=1,00 MRR=1,00 OK</w:t>
+      </w:r>
+    </w:p>
+    <w:p>
+      <w:pPr>
+        <w:spacing w:before="0" w:after="0"/>
+      </w:pPr>
+      <w:r>
+        <w:t>E12 rec=3 Prec=0,33 Rec=1,00 Faith=1,00 P@1=1,00 MRR=1,00 OK</w:t>
+      </w:r>
+    </w:p>
+    <w:p>
+      <w:pPr>
+        <w:spacing w:before="0" w:after="0"/>
+      </w:pPr>
+      <w:r>
+        <w:t>Precision=0,28 | Recall=1,00 | Faithfulness=1,00 | Relevancy=1,00 | Precision@1=1,00 | MRR=1,00</w:t>
+      </w:r>
+    </w:p>
+    <w:p>
+      <w:pPr>
+        <w:spacing w:before="0" w:after="160"/>
+      </w:pPr>
+      <w:r>
+        <w:t>(Caveat: medido con stub determinista; con LLM real la faithfulness puede bajar si el modelo cita marcadores inexistentes, que el guardarraíl descarta. Lectura: Precision@1 y MRR en 1,00 muestran que el ruido de k=5 queda abajo en el ranking y el paquete pertinente siempre aparece primero; por eso el Recall es total aunque la Precision sea moderada.)</w:t>
+      </w:r>
+    </w:p>
+    <w:p>
+      <w:pPr>
+        <w:pStyle w:val="Heading1"/>
+        <w:spacing w:before="120" w:after="60"/>
+      </w:pPr>
+      <w:r>
+        <w:rPr>
+          <w:rFonts w:ascii="Times New Roman" w:hAnsi="Times New Roman" w:eastAsia="Times New Roman" w:cs="Times New Roman"/>
+          <w:b/>
+          <w:bCs/>
+          <w:color w:val="2E74B5"/>
           <w:sz w:val="26"/>
           <w:szCs w:val="26"/>
         </w:rPr>
-        <w:t xml:space="preserve">Conclusiones</w:t>
+        <w:t>Conclusiones</w:t>
       </w:r>
     </w:p>
     <w:p>
@@ -1136,27 +2260,84 @@
       </w:pPr>
       <w:r>
         <w:rPr>
-          <w:rFonts w:ascii="Times New Roman" w:cs="Times New Roman" w:eastAsia="Times New Roman" w:hAnsi="Times New Roman"/>
-          <w:sz w:val="22"/>
-          <w:szCs w:val="22"/>
-        </w:rPr>
-        <w:t xml:space="preserve">El agente cumple los cinco requerimientos: recupera paquetes con RAG filtrable, verifica fuentes externas en vivo, replanifica automÃ¡ticamente con criterio auditable, cita la fuente de cada decisiÃ³n y registra trazabilidad por paso, con 100% de acierto en los 12 casos de evaluaciÃ³n (meta 85%). Las limitaciones son conocidas y documentadas: el estado de senderos es una fuente simulada (CONAF no ofrece API pÃºblica) y Open-Meteo no cubre fechas a mÃ¡s de unos 16 dÃ­as, caso en el que el clima no se evalÃºa y la decisiÃ³n queda respaldada por las demÃ¡s fuentes. Como trabajo futuro: integrar la API de reservas de guÃ­as en lugar del roster estÃ¡tico y ampliar los evals con casos adversarios de redacciÃ³n.</w:t>
-      </w:r>
-    </w:p>
-    <w:p>
-      <w:pPr>
-        <w:pStyle w:val="Heading1"/>
-        <w:spacing w:after="60" w:before="120"/>
-      </w:pPr>
-      <w:r>
-        <w:rPr>
-          <w:rFonts w:ascii="Times New Roman" w:cs="Times New Roman" w:eastAsia="Times New Roman" w:hAnsi="Times New Roman"/>
+          <w:rFonts w:ascii="Times New Roman" w:hAnsi="Times New Roman" w:eastAsia="Times New Roman" w:cs="Times New Roman"/>
+          <w:sz w:val="22"/>
+          <w:szCs w:val="22"/>
+        </w:rPr>
+        <w:t>El agente cumple los cinco requerimientos: recupera paquetes con RAG filtrable, verifica fuentes externas en vivo, replanifica automáticamente con criterio auditable, cita la fuente de cada decisión y registra trazabilidad por paso, con 100% de acierto en los 12 casos de evaluación (meta 85%). Las limitaciones son conocidas y documentadas: el estado de senderos es una fuente simulada (CONAF no ofrece API pública) y Open-Meteo no cubre fechas a más de unos 16 días, caso en el que el clima no se evalúa y la decisión queda respaldada por las demás fuentes. Como trabajo futuro: integrar la API de reservas de guías en lugar del roster estático y ampliar los evals con casos adversarios de redacción.</w:t>
+      </w:r>
+    </w:p>
+    <w:p>
+      <w:pPr>
+        <w:spacing w:before="0" w:after="160"/>
+      </w:pPr>
+      <w:r>
+        <w:rPr>
+          <w:rFonts w:ascii="Times New Roman" w:hAnsi="Times New Roman" w:eastAsia="Times New Roman" w:cs="Times New Roman"/>
           <w:b/>
           <w:bCs/>
+          <w:sz w:val="22"/>
+          <w:szCs w:val="22"/>
+        </w:rPr>
+        <w:t>Reflexión individual</w:t>
+      </w:r>
+    </w:p>
+    <w:p>
+      <w:pPr>
+        <w:spacing w:before="0" w:after="160"/>
+      </w:pPr>
+      <w:r>
+        <w:rPr>
+          <w:rFonts w:ascii="Times New Roman" w:cs="Times New Roman"/>
+          <w:sz w:val="22"/>
+          <w:szCs w:val="22"/>
+        </w:rPr>
+        <w:t>Con la creación de este prototipo aprendí más sobre LLM y RAG, entendí que juntar ambos puede servir para crear un poderoso agente que sirva para resolver problemas de la vida real sin que este necesariamente tenga el mismo funcionamiento y RIESGO de usar un chat de IA convencional como por ej. ChatGPT o Gemini. Estos agentes pueden ser altamente configurados, personalizados y estructurados para cualquier contexto y pueden facilitar cosas sin necesariamente "reemplazar" el trabajo humano. Lo más difícil para mí durante este proyecto fue la selección del caso/contexto y la planificación para el agente, empecé con un caso real de la empresa Oxford (https://oxfordstore.cl/), después pasé a la idea de un agente que ayude a la gente a planificar viajes de turismo considerando varios factores reales como las predicciones del clima y terminé quedándome con ese contexto del ecoturismo, que además me permitió probar algo distinto al otro prototipo: en vez de calcular dosis, el agente verifica senderos, clima y guías, y replanifica solo cuando corresponde.</w:t>
+      </w:r>
+    </w:p>
+    <w:p>
+      <w:pPr>
+        <w:spacing w:before="0" w:after="160"/>
+      </w:pPr>
+      <w:r>
+        <w:rPr>
+          <w:rFonts w:ascii="Times New Roman" w:hAnsi="Times New Roman" w:eastAsia="Times New Roman" w:cs="Times New Roman"/>
+          <w:b/>
+          <w:bCs/>
+          <w:sz w:val="22"/>
+          <w:szCs w:val="22"/>
+        </w:rPr>
+        <w:t>Declaración de uso de IA</w:t>
+      </w:r>
+    </w:p>
+    <w:p>
+      <w:pPr>
+        <w:spacing w:before="0" w:after="160"/>
+      </w:pPr>
+      <w:r>
+        <w:rPr>
+          <w:rFonts w:ascii="Times New Roman" w:hAnsi="Times New Roman" w:eastAsia="Times New Roman" w:cs="Times New Roman"/>
+          <w:sz w:val="22"/>
+          <w:szCs w:val="22"/>
+        </w:rPr>
+        <w:t>Se usó asistencia de IA para redacción y código inicial base del proyecto; todo contenido generado fue revisado y validado. Las conclusiones, justificaciones técnicas y la reflexión individual son de autoría propia, sin apoyo de IA.</w:t>
+      </w:r>
+    </w:p>
+    <w:p>
+      <w:pPr>
+        <w:pStyle w:val="Heading1"/>
+        <w:spacing w:before="120" w:after="60"/>
+      </w:pPr>
+      <w:r>
+        <w:rPr>
+          <w:rFonts w:ascii="Times New Roman" w:hAnsi="Times New Roman" w:eastAsia="Times New Roman" w:cs="Times New Roman"/>
+          <w:b/>
+          <w:bCs/>
+          <w:color w:val="2E74B5"/>
           <w:sz w:val="26"/>
           <w:szCs w:val="26"/>
         </w:rPr>
-        <w:t xml:space="preserve">Referencias</w:t>
+        <w:t>Referencias</w:t>
       </w:r>
     </w:p>
     <w:p>
@@ -1166,11 +2347,11 @@
       </w:pPr>
       <w:r>
         <w:rPr>
-          <w:rFonts w:ascii="Times New Roman" w:cs="Times New Roman" w:eastAsia="Times New Roman" w:hAnsi="Times New Roman"/>
-          <w:sz w:val="22"/>
-          <w:szCs w:val="22"/>
-        </w:rPr>
-        <w:t xml:space="preserve">Lewis, P., Perez, E., Piktus, A., Petroni, F., Karpukhin, V., Goyal, N., KÃ¼ttler, H., Lewis, M., Yih, W., RocktÃ¤schel, T., Riedel, S., &amp; Kiela, D. (2020). Retrieval-augmented generation for knowledge-intensive NLP tasks. Advances in Neural Information Processing Systems, 33, 9459â€“9474.</w:t>
+          <w:rFonts w:ascii="Times New Roman" w:hAnsi="Times New Roman" w:eastAsia="Times New Roman" w:cs="Times New Roman"/>
+          <w:sz w:val="22"/>
+          <w:szCs w:val="22"/>
+        </w:rPr>
+        <w:t>Lewis, P., Perez, E., Piktus, A., Petroni, F., Karpukhin, V., Goyal, N., Küttler, H., Lewis, M., Yih, W., Rocktäschel, T., Riedel, S., &amp; Kiela, D. (2020). Retrieval-augmented generation for knowledge-intensive NLP tasks. Advances in Neural Information Processing Systems, 33, 9459–9474.</w:t>
       </w:r>
     </w:p>
     <w:p>
@@ -1180,11 +2361,11 @@
       </w:pPr>
       <w:r>
         <w:rPr>
-          <w:rFonts w:ascii="Times New Roman" w:cs="Times New Roman" w:eastAsia="Times New Roman" w:hAnsi="Times New Roman"/>
-          <w:sz w:val="22"/>
-          <w:szCs w:val="22"/>
-        </w:rPr>
-        <w:t xml:space="preserve">Open-Meteo. (2026). Open-Meteo API: Free weather forecast API for non-commercial use. https://open-meteo.com/</w:t>
+          <w:rFonts w:ascii="Times New Roman" w:hAnsi="Times New Roman" w:eastAsia="Times New Roman" w:cs="Times New Roman"/>
+          <w:sz w:val="22"/>
+          <w:szCs w:val="22"/>
+        </w:rPr>
+        <w:t>Open-Meteo. (2026). Open-Meteo API: Free weather forecast API for non-commercial use. https://open-meteo.com/</w:t>
       </w:r>
     </w:p>
     <w:p>
@@ -1194,11 +2375,11 @@
       </w:pPr>
       <w:r>
         <w:rPr>
-          <w:rFonts w:ascii="Times New Roman" w:cs="Times New Roman" w:eastAsia="Times New Roman" w:hAnsi="Times New Roman"/>
-          <w:sz w:val="22"/>
-          <w:szCs w:val="22"/>
-        </w:rPr>
-        <w:t xml:space="preserve">Reimers, N., &amp; Gurevych, I. (2019). Sentence-BERT: Sentence embeddings using Siamese BERT-networks. Proceedings of EMNLP-IJCNLP, 3982â€“3992.</w:t>
+          <w:rFonts w:ascii="Times New Roman" w:hAnsi="Times New Roman" w:eastAsia="Times New Roman" w:cs="Times New Roman"/>
+          <w:sz w:val="22"/>
+          <w:szCs w:val="22"/>
+        </w:rPr>
+        <w:t>Reimers, N., &amp; Gurevych, I. (2019). Sentence-BERT: Sentence embeddings using Siamese BERT-networks. Proceedings of EMNLP-IJCNLP, 3982–3992.</w:t>
       </w:r>
     </w:p>
     <w:p>
@@ -1208,18 +2389,18 @@
       </w:pPr>
       <w:r>
         <w:rPr>
-          <w:rFonts w:ascii="Times New Roman" w:cs="Times New Roman" w:eastAsia="Times New Roman" w:hAnsi="Times New Roman"/>
-          <w:sz w:val="22"/>
-          <w:szCs w:val="22"/>
-        </w:rPr>
-        <w:t xml:space="preserve">Yao, S., Zhao, J., Yu, D., Du, N., Shafran, I., Narasimhan, K., &amp; Cao, Y. (2023). ReAct: Synergizing reasoning and acting in language models. International Conference on Learning Representations.</w:t>
+          <w:rFonts w:ascii="Times New Roman" w:hAnsi="Times New Roman" w:eastAsia="Times New Roman" w:cs="Times New Roman"/>
+          <w:sz w:val="22"/>
+          <w:szCs w:val="22"/>
+        </w:rPr>
+        <w:t>Yao, S., Zhao, J., Yu, D., Du, N., Shafran, I., Narasimhan, K., &amp; Cao, Y. (2023). ReAct: Synergizing reasoning and acting in language models. International Conference on Learning Representations.</w:t>
       </w:r>
     </w:p>
     <w:sectPr>
+      <w:headerReference w:type="default" r:id="rId9"/>
       <w:footerReference w:type="default" r:id="rId7"/>
-      <w:pgSz w:w="11906" w:h="16838" w:orient="portrait"/>
+      <w:pgSz w:w="11906" w:h="16838"/>
       <w:pgMar w:top="1440" w:right="1440" w:bottom="1440" w:left="1440" w:header="708" w:footer="708" w:gutter="0"/>
-      <w:pgNumType/>
       <w:docGrid w:linePitch="360"/>
     </w:sectPr>
   </w:body>
@@ -1231,7 +2412,7 @@
 </file>
 
 <file path=word/endnotes.xml><?xml version="1.0" encoding="utf-8"?>
-<w:endnotes xmlns:wpc="http://schemas.microsoft.com/office/word/2010/wordprocessingCanvas" xmlns:mc="http://schemas.openxmlformats.org/markup-compatibility/2006" xmlns:o="urn:schemas-microsoft-com:office:office" xmlns:r="http://schemas.openxmlformats.org/officeDocument/2006/relationships" xmlns:m="http://schemas.openxmlformats.org/officeDocument/2006/math" xmlns:v="urn:schemas-microsoft-com:vml" xmlns:wp14="http://schemas.microsoft.com/office/word/2010/wordprocessingDrawing" xmlns:wp="http://schemas.openxmlformats.org/drawingml/2006/wordprocessingDrawing" xmlns:w10="urn:schemas-microsoft-com:office:word" xmlns:w="http://schemas.openxmlformats.org/wordprocessingml/2006/main" xmlns:w14="http://schemas.microsoft.com/office/word/2010/wordml" xmlns:w15="http://schemas.microsoft.com/office/word/2012/wordml" xmlns:wpg="http://schemas.microsoft.com/office/word/2010/wordprocessingGroup" xmlns:wpi="http://schemas.microsoft.com/office/word/2010/wordprocessingInk" xmlns:wne="http://schemas.microsoft.com/office/word/2006/wordml" xmlns:wps="http://schemas.microsoft.com/office/word/2010/wordprocessingShape" mc:Ignorable="w14 w15 wp14">
+<w:endnotes xmlns:wpc="http://schemas.microsoft.com/office/word/2010/wordprocessingCanvas" xmlns:cx="http://schemas.microsoft.com/office/drawing/2014/chartex" xmlns:cx1="http://schemas.microsoft.com/office/drawing/2015/9/8/chartex" xmlns:cx2="http://schemas.microsoft.com/office/drawing/2015/10/21/chartex" xmlns:cx3="http://schemas.microsoft.com/office/drawing/2016/5/9/chartex" xmlns:cx4="http://schemas.microsoft.com/office/drawing/2016/5/10/chartex" xmlns:cx5="http://schemas.microsoft.com/office/drawing/2016/5/11/chartex" xmlns:cx6="http://schemas.microsoft.com/office/drawing/2016/5/12/chartex" xmlns:cx7="http://schemas.microsoft.com/office/drawing/2016/5/13/chartex" xmlns:cx8="http://schemas.microsoft.com/office/drawing/2016/5/14/chartex" xmlns:mc="http://schemas.openxmlformats.org/markup-compatibility/2006" xmlns:aink="http://schemas.microsoft.com/office/drawing/2016/ink" xmlns:am3d="http://schemas.microsoft.com/office/drawing/2017/model3d" xmlns:o="urn:schemas-microsoft-com:office:office" xmlns:oel="http://schemas.microsoft.com/office/2019/extlst" xmlns:r="http://schemas.openxmlformats.org/officeDocument/2006/relationships" xmlns:m="http://schemas.openxmlformats.org/officeDocument/2006/math" xmlns:v="urn:schemas-microsoft-com:vml" xmlns:wp14="http://schemas.microsoft.com/office/word/2010/wordprocessingDrawing" xmlns:wp="http://schemas.openxmlformats.org/drawingml/2006/wordprocessingDrawing" xmlns:w10="urn:schemas-microsoft-com:office:word" xmlns:w="http://schemas.openxmlformats.org/wordprocessingml/2006/main" xmlns:w14="http://schemas.microsoft.com/office/word/2010/wordml" xmlns:w15="http://schemas.microsoft.com/office/word/2012/wordml" xmlns:w16cex="http://schemas.microsoft.com/office/word/2018/wordml/cex" xmlns:w16cid="http://schemas.microsoft.com/office/word/2016/wordml/cid" xmlns:w16="http://schemas.microsoft.com/office/word/2018/wordml" xmlns:w16du="http://schemas.microsoft.com/office/word/2023/wordml/word16du" xmlns:w16sdtdh="http://schemas.microsoft.com/office/word/2020/wordml/sdtdatahash" xmlns:w16sdtfl="http://schemas.microsoft.com/office/word/2024/wordml/sdtformatlock" xmlns:w16se="http://schemas.microsoft.com/office/word/2015/wordml/symex" xmlns:wpg="http://schemas.microsoft.com/office/word/2010/wordprocessingGroup" xmlns:wpi="http://schemas.microsoft.com/office/word/2010/wordprocessingInk" xmlns:wne="http://schemas.microsoft.com/office/word/2006/wordml" xmlns:wps="http://schemas.microsoft.com/office/word/2010/wordprocessingShape" mc:Ignorable="w14 w15 w16se w16cid w16 w16cex w16sdtdh w16sdtfl w16du wp14">
   <w:endnote w:type="separator" w:id="-1">
     <w:p>
       <w:pPr>
@@ -1268,14 +2449,14 @@
 </file>
 
 <file path=word/footer1.xml><?xml version="1.0" encoding="utf-8"?>
-<w:ftr xmlns:wpc="http://schemas.microsoft.com/office/word/2010/wordprocessingCanvas" xmlns:mc="http://schemas.openxmlformats.org/markup-compatibility/2006" xmlns:o="urn:schemas-microsoft-com:office:office" xmlns:r="http://schemas.openxmlformats.org/officeDocument/2006/relationships" xmlns:m="http://schemas.openxmlformats.org/officeDocument/2006/math" xmlns:v="urn:schemas-microsoft-com:vml" xmlns:wp14="http://schemas.microsoft.com/office/word/2010/wordprocessingDrawing" xmlns:wp="http://schemas.openxmlformats.org/drawingml/2006/wordprocessingDrawing" xmlns:w10="urn:schemas-microsoft-com:office:word" xmlns:w="http://schemas.openxmlformats.org/wordprocessingml/2006/main" xmlns:w14="http://schemas.microsoft.com/office/word/2010/wordml" xmlns:w15="http://schemas.microsoft.com/office/word/2012/wordml" xmlns:wpg="http://schemas.microsoft.com/office/word/2010/wordprocessingGroup" xmlns:wpi="http://schemas.microsoft.com/office/word/2010/wordprocessingInk" xmlns:wne="http://schemas.microsoft.com/office/word/2006/wordml" xmlns:wps="http://schemas.microsoft.com/office/word/2010/wordprocessingShape">
+<w:ftr xmlns:wpc="http://schemas.microsoft.com/office/word/2010/wordprocessingCanvas" xmlns:mc="http://schemas.openxmlformats.org/markup-compatibility/2006" xmlns:o="urn:schemas-microsoft-com:office:office" xmlns:r="http://schemas.openxmlformats.org/officeDocument/2006/relationships" xmlns:m="http://schemas.openxmlformats.org/officeDocument/2006/math" xmlns:v="urn:schemas-microsoft-com:vml" xmlns:wp14="http://schemas.microsoft.com/office/word/2010/wordprocessingDrawing" xmlns:wp="http://schemas.openxmlformats.org/drawingml/2006/wordprocessingDrawing" xmlns:w10="urn:schemas-microsoft-com:office:word" xmlns:w="http://schemas.openxmlformats.org/wordprocessingml/2006/main" xmlns:w14="http://schemas.microsoft.com/office/word/2010/wordml" xmlns:w15="http://schemas.microsoft.com/office/word/2012/wordml" xmlns:w16se="http://schemas.microsoft.com/office/word/2015/wordml/symex" xmlns:w16cid="http://schemas.microsoft.com/office/word/2016/wordml/cid" xmlns:w16="http://schemas.microsoft.com/office/word/2018/wordml" xmlns:w16cex="http://schemas.microsoft.com/office/word/2018/wordml/cex" xmlns:w16sdtdh="http://schemas.microsoft.com/office/word/2020/wordml/sdtdatahash" xmlns:wne="http://schemas.microsoft.com/office/word/2006/wordml" xmlns:wpg="http://schemas.microsoft.com/office/word/2010/wordprocessingGroup" xmlns:wps="http://schemas.microsoft.com/office/word/2010/wordprocessingShape">
   <w:p>
     <w:pPr>
       <w:jc w:val="center"/>
     </w:pPr>
     <w:r>
       <w:rPr>
-        <w:rFonts w:ascii="Times New Roman" w:cs="Times New Roman" w:eastAsia="Times New Roman" w:hAnsi="Times New Roman"/>
+        <w:rFonts w:ascii="Times New Roman" w:hAnsi="Times New Roman" w:eastAsia="Times New Roman" w:cs="Times New Roman"/>
         <w:sz w:val="22"/>
         <w:szCs w:val="22"/>
       </w:rPr>
@@ -1283,13 +2464,34 @@
     </w:r>
     <w:r>
       <w:rPr>
-        <w:rFonts w:ascii="Times New Roman" w:cs="Times New Roman" w:eastAsia="Times New Roman" w:hAnsi="Times New Roman"/>
+        <w:rFonts w:ascii="Times New Roman" w:hAnsi="Times New Roman" w:eastAsia="Times New Roman" w:cs="Times New Roman"/>
         <w:sz w:val="20"/>
         <w:szCs w:val="20"/>
       </w:rPr>
       <w:fldChar w:fldCharType="begin"/>
-      <w:instrText xml:space="preserve">PAGE</w:instrText>
+    </w:r>
+    <w:r>
+      <w:rPr>
+        <w:rFonts w:ascii="Times New Roman" w:hAnsi="Times New Roman" w:eastAsia="Times New Roman" w:cs="Times New Roman"/>
+        <w:sz w:val="20"/>
+        <w:szCs w:val="20"/>
+      </w:rPr>
+      <w:instrText>PAGE</w:instrText>
+    </w:r>
+    <w:r>
+      <w:rPr>
+        <w:rFonts w:ascii="Times New Roman" w:hAnsi="Times New Roman" w:eastAsia="Times New Roman" w:cs="Times New Roman"/>
+        <w:sz w:val="20"/>
+        <w:szCs w:val="20"/>
+      </w:rPr>
       <w:fldChar w:fldCharType="separate"/>
+    </w:r>
+    <w:r>
+      <w:rPr>
+        <w:rFonts w:ascii="Times New Roman" w:hAnsi="Times New Roman" w:eastAsia="Times New Roman" w:cs="Times New Roman"/>
+        <w:sz w:val="20"/>
+        <w:szCs w:val="20"/>
+      </w:rPr>
       <w:fldChar w:fldCharType="end"/>
     </w:r>
   </w:p>
@@ -1297,7 +2499,7 @@
 </file>
 
 <file path=word/footnotes.xml><?xml version="1.0" encoding="utf-8"?>
-<w:footnotes xmlns:wpc="http://schemas.microsoft.com/office/word/2010/wordprocessingCanvas" xmlns:mc="http://schemas.openxmlformats.org/markup-compatibility/2006" xmlns:o="urn:schemas-microsoft-com:office:office" xmlns:r="http://schemas.openxmlformats.org/officeDocument/2006/relationships" xmlns:m="http://schemas.openxmlformats.org/officeDocument/2006/math" xmlns:v="urn:schemas-microsoft-com:vml" xmlns:wp14="http://schemas.microsoft.com/office/word/2010/wordprocessingDrawing" xmlns:wp="http://schemas.openxmlformats.org/drawingml/2006/wordprocessingDrawing" xmlns:w10="urn:schemas-microsoft-com:office:word" xmlns:w="http://schemas.openxmlformats.org/wordprocessingml/2006/main" xmlns:w14="http://schemas.microsoft.com/office/word/2010/wordml" xmlns:w15="http://schemas.microsoft.com/office/word/2012/wordml" xmlns:wpg="http://schemas.microsoft.com/office/word/2010/wordprocessingGroup" xmlns:wpi="http://schemas.microsoft.com/office/word/2010/wordprocessingInk" xmlns:wne="http://schemas.microsoft.com/office/word/2006/wordml" xmlns:wps="http://schemas.microsoft.com/office/word/2010/wordprocessingShape" mc:Ignorable="w14 w15 wp14">
+<w:footnotes xmlns:wpc="http://schemas.microsoft.com/office/word/2010/wordprocessingCanvas" xmlns:cx="http://schemas.microsoft.com/office/drawing/2014/chartex" xmlns:cx1="http://schemas.microsoft.com/office/drawing/2015/9/8/chartex" xmlns:cx2="http://schemas.microsoft.com/office/drawing/2015/10/21/chartex" xmlns:cx3="http://schemas.microsoft.com/office/drawing/2016/5/9/chartex" xmlns:cx4="http://schemas.microsoft.com/office/drawing/2016/5/10/chartex" xmlns:cx5="http://schemas.microsoft.com/office/drawing/2016/5/11/chartex" xmlns:cx6="http://schemas.microsoft.com/office/drawing/2016/5/12/chartex" xmlns:cx7="http://schemas.microsoft.com/office/drawing/2016/5/13/chartex" xmlns:cx8="http://schemas.microsoft.com/office/drawing/2016/5/14/chartex" xmlns:mc="http://schemas.openxmlformats.org/markup-compatibility/2006" xmlns:aink="http://schemas.microsoft.com/office/drawing/2016/ink" xmlns:am3d="http://schemas.microsoft.com/office/drawing/2017/model3d" xmlns:o="urn:schemas-microsoft-com:office:office" xmlns:oel="http://schemas.microsoft.com/office/2019/extlst" xmlns:r="http://schemas.openxmlformats.org/officeDocument/2006/relationships" xmlns:m="http://schemas.openxmlformats.org/officeDocument/2006/math" xmlns:v="urn:schemas-microsoft-com:vml" xmlns:wp14="http://schemas.microsoft.com/office/word/2010/wordprocessingDrawing" xmlns:wp="http://schemas.openxmlformats.org/drawingml/2006/wordprocessingDrawing" xmlns:w10="urn:schemas-microsoft-com:office:word" xmlns:w="http://schemas.openxmlformats.org/wordprocessingml/2006/main" xmlns:w14="http://schemas.microsoft.com/office/word/2010/wordml" xmlns:w15="http://schemas.microsoft.com/office/word/2012/wordml" xmlns:w16cex="http://schemas.microsoft.com/office/word/2018/wordml/cex" xmlns:w16cid="http://schemas.microsoft.com/office/word/2016/wordml/cid" xmlns:w16="http://schemas.microsoft.com/office/word/2018/wordml" xmlns:w16du="http://schemas.microsoft.com/office/word/2023/wordml/word16du" xmlns:w16sdtdh="http://schemas.microsoft.com/office/word/2020/wordml/sdtdatahash" xmlns:w16sdtfl="http://schemas.microsoft.com/office/word/2024/wordml/sdtformatlock" xmlns:w16se="http://schemas.microsoft.com/office/word/2015/wordml/symex" xmlns:wpg="http://schemas.microsoft.com/office/word/2010/wordprocessingGroup" xmlns:wpi="http://schemas.microsoft.com/office/word/2010/wordprocessingInk" xmlns:wne="http://schemas.microsoft.com/office/word/2006/wordml" xmlns:wps="http://schemas.microsoft.com/office/word/2010/wordprocessingShape" mc:Ignorable="w14 w15 w16se w16cid w16 w16cex w16sdtdh w16sdtfl w16du wp14">
   <w:footnote w:type="separator" w:id="-1">
     <w:p>
       <w:pPr>
@@ -1331,6 +2533,16 @@
     </w:p>
   </w:footnote>
 </w:footnotes>
+</file>
+
+<file path=word/header1.xml><?xml version="1.0" encoding="utf-8"?>
+<w:hdr xmlns:wpc="http://schemas.microsoft.com/office/word/2010/wordprocessingCanvas" xmlns:mc="http://schemas.openxmlformats.org/markup-compatibility/2006" xmlns:o="urn:schemas-microsoft-com:office:office" xmlns:r="http://schemas.openxmlformats.org/officeDocument/2006/relationships" xmlns:m="http://schemas.openxmlformats.org/officeDocument/2006/math" xmlns:v="urn:schemas-microsoft-com:vml" xmlns:wp14="http://schemas.microsoft.com/office/word/2010/wordprocessingDrawing" xmlns:wp="http://schemas.openxmlformats.org/drawingml/2006/wordprocessingDrawing" xmlns:w10="urn:schemas-microsoft-com:office:word" xmlns:w="http://schemas.openxmlformats.org/wordprocessingml/2006/main" xmlns:w14="http://schemas.microsoft.com/office/word/2010/wordml" xmlns:w15="http://schemas.microsoft.com/office/word/2012/wordml" xmlns:w16se="http://schemas.microsoft.com/office/word/2015/wordml/symex" xmlns:w16cid="http://schemas.microsoft.com/office/word/2016/wordml/cid" xmlns:w16="http://schemas.microsoft.com/office/word/2018/wordml" xmlns:w16cex="http://schemas.microsoft.com/office/word/2018/wordml/cex" xmlns:w16sdtdh="http://schemas.microsoft.com/office/word/2020/wordml/sdtdatahash" xmlns:wne="http://schemas.microsoft.com/office/word/2006/wordml" xmlns:wpg="http://schemas.microsoft.com/office/word/2010/wordprocessingGroup" xmlns:wps="http://schemas.microsoft.com/office/word/2010/wordprocessingShape">
+  <w:p>
+    <w:pPr>
+      <w:pStyle w:val="Header"/>
+    </w:pPr>
+  </w:p>
+</w:hdr>
 </file>
 
 <file path=word/numbering.xml><?xml version="1.0" encoding="utf-8"?>

</xml_diff>

<commit_message>
docs: documentar ClienteLangChain por defecto y tracing LangSmith + ref APA
</commit_message>
<xml_diff>
--- a/docs/EP1_ISY0101_Informe.docx
+++ b/docs/EP1_ISY0101_Informe.docx
@@ -1305,7 +1305,7 @@
           <w:sz w:val="22"/>
           <w:szCs w:val="22"/>
         </w:rPr>
-        <w:t>Los componentes clave y su integración son: (a) cliente LLM intercambiable (agent/llm_client.py) que abstrae Groq gpt-oss-120b y permite sustituir el proveedor con una línea; (b) Recuperador (ChromaDB + embeddings locales); (c) tres herramientas de verificación con contratos tipados (estado del sendero, clima con umbrales explícitos de lluvia ≥10 mm, viento ≥50 km/h y mínima ≤-2 °C, y disponibilidad de guía); (d) Replanificador (tools/replanner.py) con criterio determinista de elección; (e) capa de prompts con el par SISTEMA_BASE/SISTEMA_REPLAN; y (f) el Trazador JSONL transversal. Para la demostración se implementó una CLI (main.py con banderas --fecha, --pasos y --falso) y un notebook con cinco casos, incluyendo una replanificación y una replanificación fallida. La demostración se complementa con una interfaz Streamlit (app.py) que expone los dos casos del guión en modo determinista. Como observabilidad opcional se integró ClienteLangChain (ChatGroq vía langchain-groq, mismo contrato completar()) y activación de LangSmith solo si existe LANGSMITH_API_KEY en el entorno; sin clave el trazado es no-op y los tests no cambian.</w:t>
+        <w:t>Los componentes clave y su integración son: (a) cliente LLM (agent/llm_client.py): ClienteLangChain por defecto (ChatGroq vía langchain-groq, Groq gpt-oss-120b; ClienteFalso determinista con --falso); (b) Recuperador (ChromaDB + embeddings locales); (c) tres herramientas de verificación con contratos tipados (estado del sendero, clima con umbrales explícitos de lluvia ≥10 mm, viento ≥50 km/h y mínima ≤-2 °C, y disponibilidad de guía); (d) Replanificador (tools/replanner.py) con criterio determinista de elección; (e) capa de prompts con el par SISTEMA_BASE/SISTEMA_REPLAN; y (f) el Trazador JSONL transversal. Para la demostración se implementó una CLI (main.py con banderas --fecha, --pasos y --falso) y un notebook con cinco casos, incluyendo una replanificación y una replanificación fallida. La demostración se complementa con una interfaz Streamlit (app.py) que expone los dos casos del guión en modo determinista. Como observabilidad, planificar() está decorado con @traceable y main.py/app.py activan LangSmith cuando existe LANGSMITH_API_KEY en el entorno, registrando timeline de pasos, latencias y tokens por corrida; sin clave el trazado es no-op y los tests no cambian.</w:t>
       </w:r>
     </w:p>
     <w:p>
@@ -2338,6 +2338,11 @@
           <w:szCs w:val="26"/>
         </w:rPr>
         <w:t>Referencias</w:t>
+      </w:r>
+    </w:p>
+    <w:p>
+      <w:r>
+        <w:t>LangChain. (2026). LangSmith: Observability and evaluation for LLM applications. https://www.langchain.com/langsmith</w:t>
       </w:r>
     </w:p>
     <w:p>

</xml_diff>